<commit_message>
fixed error causing wrong model to be displayed in LabID planned robustness check
</commit_message>
<xml_diff>
--- a/analysis-code/results.docx
+++ b/analysis-code/results.docx
@@ -16257,19 +16257,19 @@
               <w:jc w:val="right"/>
             </w:pPr>
             <w:r>
-              <w:t xml:space="preserve">-0.539</w:t>
-            </w:r>
-          </w:p>
-        </w:tc>
-        <w:tc>
-          <w:tcPr/>
-          <w:p>
-            <w:pPr>
-              <w:pStyle w:val="Compact"/>
-              <w:jc w:val="right"/>
-            </w:pPr>
-            <w:r>
-              <w:t xml:space="preserve">0.221</w:t>
+              <w:t xml:space="preserve">-0.535</w:t>
+            </w:r>
+          </w:p>
+        </w:tc>
+        <w:tc>
+          <w:tcPr/>
+          <w:p>
+            <w:pPr>
+              <w:pStyle w:val="Compact"/>
+              <w:jc w:val="right"/>
+            </w:pPr>
+            <w:r>
+              <w:t xml:space="preserve">0.065</w:t>
             </w:r>
           </w:p>
         </w:tc>
@@ -16281,19 +16281,19 @@
               <w:jc w:val="center"/>
             </w:pPr>
             <w:r>
-              <w:t xml:space="preserve">[-0.972, -0.105]</w:t>
-            </w:r>
-          </w:p>
-        </w:tc>
-        <w:tc>
-          <w:tcPr/>
-          <w:p>
-            <w:pPr>
-              <w:pStyle w:val="Compact"/>
-              <w:jc w:val="right"/>
-            </w:pPr>
-            <w:r>
-              <w:t xml:space="preserve">.015</w:t>
+              <w:t xml:space="preserve">[-0.663, -0.407]</w:t>
+            </w:r>
+          </w:p>
+        </w:tc>
+        <w:tc>
+          <w:tcPr/>
+          <w:p>
+            <w:pPr>
+              <w:pStyle w:val="Compact"/>
+              <w:jc w:val="right"/>
+            </w:pPr>
+            <w:r>
+              <w:t xml:space="preserve">&lt; .001</w:t>
             </w:r>
           </w:p>
         </w:tc>
@@ -16319,19 +16319,19 @@
               <w:jc w:val="right"/>
             </w:pPr>
             <w:r>
-              <w:t xml:space="preserve">0.635</w:t>
-            </w:r>
-          </w:p>
-        </w:tc>
-        <w:tc>
-          <w:tcPr/>
-          <w:p>
-            <w:pPr>
-              <w:pStyle w:val="Compact"/>
-              <w:jc w:val="right"/>
-            </w:pPr>
-            <w:r>
-              <w:t xml:space="preserve">0.030</w:t>
+              <w:t xml:space="preserve">0.601</w:t>
+            </w:r>
+          </w:p>
+        </w:tc>
+        <w:tc>
+          <w:tcPr/>
+          <w:p>
+            <w:pPr>
+              <w:pStyle w:val="Compact"/>
+              <w:jc w:val="right"/>
+            </w:pPr>
+            <w:r>
+              <w:t xml:space="preserve">0.027</w:t>
             </w:r>
           </w:p>
         </w:tc>
@@ -16343,7 +16343,7 @@
               <w:jc w:val="center"/>
             </w:pPr>
             <w:r>
-              <w:t xml:space="preserve">[0.576, 0.693]</w:t>
+              <w:t xml:space="preserve">[0.548, 0.653]</w:t>
             </w:r>
           </w:p>
         </w:tc>
@@ -16381,19 +16381,19 @@
               <w:jc w:val="right"/>
             </w:pPr>
             <w:r>
-              <w:t xml:space="preserve">0.415</w:t>
-            </w:r>
-          </w:p>
-        </w:tc>
-        <w:tc>
-          <w:tcPr/>
-          <w:p>
-            <w:pPr>
-              <w:pStyle w:val="Compact"/>
-              <w:jc w:val="right"/>
-            </w:pPr>
-            <w:r>
-              <w:t xml:space="preserve">0.037</w:t>
+              <w:t xml:space="preserve">0.393</w:t>
+            </w:r>
+          </w:p>
+        </w:tc>
+        <w:tc>
+          <w:tcPr/>
+          <w:p>
+            <w:pPr>
+              <w:pStyle w:val="Compact"/>
+              <w:jc w:val="right"/>
+            </w:pPr>
+            <w:r>
+              <w:t xml:space="preserve">0.035</w:t>
             </w:r>
           </w:p>
         </w:tc>
@@ -16405,7 +16405,7 @@
               <w:jc w:val="center"/>
             </w:pPr>
             <w:r>
-              <w:t xml:space="preserve">[0.342, 0.489]</w:t>
+              <w:t xml:space="preserve">[0.324, 0.462]</w:t>
             </w:r>
           </w:p>
         </w:tc>
@@ -16443,19 +16443,19 @@
               <w:jc w:val="right"/>
             </w:pPr>
             <w:r>
-              <w:t xml:space="preserve">-0.050</w:t>
-            </w:r>
-          </w:p>
-        </w:tc>
-        <w:tc>
-          <w:tcPr/>
-          <w:p>
-            <w:pPr>
-              <w:pStyle w:val="Compact"/>
-              <w:jc w:val="right"/>
-            </w:pPr>
-            <w:r>
-              <w:t xml:space="preserve">0.050</w:t>
+              <w:t xml:space="preserve">-0.036</w:t>
+            </w:r>
+          </w:p>
+        </w:tc>
+        <w:tc>
+          <w:tcPr/>
+          <w:p>
+            <w:pPr>
+              <w:pStyle w:val="Compact"/>
+              <w:jc w:val="right"/>
+            </w:pPr>
+            <w:r>
+              <w:t xml:space="preserve">0.047</w:t>
             </w:r>
           </w:p>
         </w:tc>
@@ -16467,20 +16467,220 @@
               <w:jc w:val="center"/>
             </w:pPr>
             <w:r>
-              <w:t xml:space="preserve">[-0.147, 0.048]</w:t>
-            </w:r>
-          </w:p>
-        </w:tc>
-        <w:tc>
-          <w:tcPr/>
-          <w:p>
-            <w:pPr>
-              <w:pStyle w:val="Compact"/>
-              <w:jc w:val="right"/>
-            </w:pPr>
-            <w:r>
-              <w:t xml:space="preserve">.317</w:t>
-            </w:r>
+              <w:t xml:space="preserve">[-0.129, 0.056]</w:t>
+            </w:r>
+          </w:p>
+        </w:tc>
+        <w:tc>
+          <w:tcPr/>
+          <w:p>
+            <w:pPr>
+              <w:pStyle w:val="Compact"/>
+              <w:jc w:val="right"/>
+            </w:pPr>
+            <w:r>
+              <w:t xml:space="preserve">.441</w:t>
+            </w:r>
+          </w:p>
+        </w:tc>
+      </w:tr>
+      <w:tr>
+        <w:tc>
+          <w:tcPr/>
+          <w:p>
+            <w:pPr>
+              <w:pStyle w:val="Compact"/>
+              <w:jc w:val="left"/>
+            </w:pPr>
+            <w:r>
+              <w:t xml:space="preserve">SD (LabID: (Intercept))</w:t>
+            </w:r>
+          </w:p>
+        </w:tc>
+        <w:tc>
+          <w:tcPr/>
+          <w:p>
+            <w:pPr>
+              <w:pStyle w:val="Compact"/>
+              <w:jc w:val="right"/>
+            </w:pPr>
+            <w:r>
+              <w:t xml:space="preserve">0.374</w:t>
+            </w:r>
+          </w:p>
+        </w:tc>
+        <w:tc>
+          <w:tcPr/>
+          <w:p>
+            <w:pPr>
+              <w:pStyle w:val="Compact"/>
+            </w:pPr>
+          </w:p>
+        </w:tc>
+        <w:tc>
+          <w:tcPr/>
+          <w:p>
+            <w:pPr>
+              <w:pStyle w:val="Compact"/>
+            </w:pPr>
+          </w:p>
+        </w:tc>
+        <w:tc>
+          <w:tcPr/>
+          <w:p>
+            <w:pPr>
+              <w:pStyle w:val="Compact"/>
+            </w:pPr>
+          </w:p>
+        </w:tc>
+      </w:tr>
+      <w:tr>
+        <w:tc>
+          <w:tcPr/>
+          <w:p>
+            <w:pPr>
+              <w:pStyle w:val="Compact"/>
+              <w:jc w:val="left"/>
+            </w:pPr>
+            <w:r>
+              <w:t xml:space="preserve">SD (Country: feedback:justification)</w:t>
+            </w:r>
+          </w:p>
+        </w:tc>
+        <w:tc>
+          <w:tcPr/>
+          <w:p>
+            <w:pPr>
+              <w:pStyle w:val="Compact"/>
+              <w:jc w:val="right"/>
+            </w:pPr>
+            <w:r>
+              <w:t xml:space="preserve">0.155</w:t>
+            </w:r>
+          </w:p>
+        </w:tc>
+        <w:tc>
+          <w:tcPr/>
+          <w:p>
+            <w:pPr>
+              <w:pStyle w:val="Compact"/>
+            </w:pPr>
+          </w:p>
+        </w:tc>
+        <w:tc>
+          <w:tcPr/>
+          <w:p>
+            <w:pPr>
+              <w:pStyle w:val="Compact"/>
+            </w:pPr>
+          </w:p>
+        </w:tc>
+        <w:tc>
+          <w:tcPr/>
+          <w:p>
+            <w:pPr>
+              <w:pStyle w:val="Compact"/>
+            </w:pPr>
+          </w:p>
+        </w:tc>
+      </w:tr>
+      <w:tr>
+        <w:tc>
+          <w:tcPr/>
+          <w:p>
+            <w:pPr>
+              <w:pStyle w:val="Compact"/>
+              <w:jc w:val="left"/>
+            </w:pPr>
+            <w:r>
+              <w:t xml:space="preserve">SD (Country: justification)</w:t>
+            </w:r>
+          </w:p>
+        </w:tc>
+        <w:tc>
+          <w:tcPr/>
+          <w:p>
+            <w:pPr>
+              <w:pStyle w:val="Compact"/>
+              <w:jc w:val="right"/>
+            </w:pPr>
+            <w:r>
+              <w:t xml:space="preserve">0.124</w:t>
+            </w:r>
+          </w:p>
+        </w:tc>
+        <w:tc>
+          <w:tcPr/>
+          <w:p>
+            <w:pPr>
+              <w:pStyle w:val="Compact"/>
+            </w:pPr>
+          </w:p>
+        </w:tc>
+        <w:tc>
+          <w:tcPr/>
+          <w:p>
+            <w:pPr>
+              <w:pStyle w:val="Compact"/>
+            </w:pPr>
+          </w:p>
+        </w:tc>
+        <w:tc>
+          <w:tcPr/>
+          <w:p>
+            <w:pPr>
+              <w:pStyle w:val="Compact"/>
+            </w:pPr>
+          </w:p>
+        </w:tc>
+      </w:tr>
+      <w:tr>
+        <w:tc>
+          <w:tcPr/>
+          <w:p>
+            <w:pPr>
+              <w:pStyle w:val="Compact"/>
+              <w:jc w:val="left"/>
+            </w:pPr>
+            <w:r>
+              <w:t xml:space="preserve">SD (Country: feedback)</w:t>
+            </w:r>
+          </w:p>
+        </w:tc>
+        <w:tc>
+          <w:tcPr/>
+          <w:p>
+            <w:pPr>
+              <w:pStyle w:val="Compact"/>
+              <w:jc w:val="right"/>
+            </w:pPr>
+            <w:r>
+              <w:t xml:space="preserve">0.008</w:t>
+            </w:r>
+          </w:p>
+        </w:tc>
+        <w:tc>
+          <w:tcPr/>
+          <w:p>
+            <w:pPr>
+              <w:pStyle w:val="Compact"/>
+            </w:pPr>
+          </w:p>
+        </w:tc>
+        <w:tc>
+          <w:tcPr/>
+          <w:p>
+            <w:pPr>
+              <w:pStyle w:val="Compact"/>
+            </w:pPr>
+          </w:p>
+        </w:tc>
+        <w:tc>
+          <w:tcPr/>
+          <w:p>
+            <w:pPr>
+              <w:pStyle w:val="Compact"/>
+            </w:pPr>
           </w:p>
         </w:tc>
       </w:tr>
@@ -16505,207 +16705,7 @@
               <w:jc w:val="right"/>
             </w:pPr>
             <w:r>
-              <w:t xml:space="preserve">0.511</w:t>
-            </w:r>
-          </w:p>
-        </w:tc>
-        <w:tc>
-          <w:tcPr/>
-          <w:p>
-            <w:pPr>
-              <w:pStyle w:val="Compact"/>
-            </w:pPr>
-          </w:p>
-        </w:tc>
-        <w:tc>
-          <w:tcPr/>
-          <w:p>
-            <w:pPr>
-              <w:pStyle w:val="Compact"/>
-            </w:pPr>
-          </w:p>
-        </w:tc>
-        <w:tc>
-          <w:tcPr/>
-          <w:p>
-            <w:pPr>
-              <w:pStyle w:val="Compact"/>
-            </w:pPr>
-          </w:p>
-        </w:tc>
-      </w:tr>
-      <w:tr>
-        <w:tc>
-          <w:tcPr/>
-          <w:p>
-            <w:pPr>
-              <w:pStyle w:val="Compact"/>
-              <w:jc w:val="left"/>
-            </w:pPr>
-            <w:r>
-              <w:t xml:space="preserve">SD (Country: feedback)</w:t>
-            </w:r>
-          </w:p>
-        </w:tc>
-        <w:tc>
-          <w:tcPr/>
-          <w:p>
-            <w:pPr>
-              <w:pStyle w:val="Compact"/>
-              <w:jc w:val="right"/>
-            </w:pPr>
-            <w:r>
-              <w:t xml:space="preserve">0.058</w:t>
-            </w:r>
-          </w:p>
-        </w:tc>
-        <w:tc>
-          <w:tcPr/>
-          <w:p>
-            <w:pPr>
-              <w:pStyle w:val="Compact"/>
-            </w:pPr>
-          </w:p>
-        </w:tc>
-        <w:tc>
-          <w:tcPr/>
-          <w:p>
-            <w:pPr>
-              <w:pStyle w:val="Compact"/>
-            </w:pPr>
-          </w:p>
-        </w:tc>
-        <w:tc>
-          <w:tcPr/>
-          <w:p>
-            <w:pPr>
-              <w:pStyle w:val="Compact"/>
-            </w:pPr>
-          </w:p>
-        </w:tc>
-      </w:tr>
-      <w:tr>
-        <w:tc>
-          <w:tcPr/>
-          <w:p>
-            <w:pPr>
-              <w:pStyle w:val="Compact"/>
-              <w:jc w:val="left"/>
-            </w:pPr>
-            <w:r>
-              <w:t xml:space="preserve">SD (Country: justification)</w:t>
-            </w:r>
-          </w:p>
-        </w:tc>
-        <w:tc>
-          <w:tcPr/>
-          <w:p>
-            <w:pPr>
-              <w:pStyle w:val="Compact"/>
-              <w:jc w:val="right"/>
-            </w:pPr>
-            <w:r>
-              <w:t xml:space="preserve">0.145</w:t>
-            </w:r>
-          </w:p>
-        </w:tc>
-        <w:tc>
-          <w:tcPr/>
-          <w:p>
-            <w:pPr>
-              <w:pStyle w:val="Compact"/>
-            </w:pPr>
-          </w:p>
-        </w:tc>
-        <w:tc>
-          <w:tcPr/>
-          <w:p>
-            <w:pPr>
-              <w:pStyle w:val="Compact"/>
-            </w:pPr>
-          </w:p>
-        </w:tc>
-        <w:tc>
-          <w:tcPr/>
-          <w:p>
-            <w:pPr>
-              <w:pStyle w:val="Compact"/>
-            </w:pPr>
-          </w:p>
-        </w:tc>
-      </w:tr>
-      <w:tr>
-        <w:tc>
-          <w:tcPr/>
-          <w:p>
-            <w:pPr>
-              <w:pStyle w:val="Compact"/>
-              <w:jc w:val="left"/>
-            </w:pPr>
-            <w:r>
-              <w:t xml:space="preserve">SD (Country: feedback:justification)</w:t>
-            </w:r>
-          </w:p>
-        </w:tc>
-        <w:tc>
-          <w:tcPr/>
-          <w:p>
-            <w:pPr>
-              <w:pStyle w:val="Compact"/>
-              <w:jc w:val="right"/>
-            </w:pPr>
-            <w:r>
-              <w:t xml:space="preserve">0.175</w:t>
-            </w:r>
-          </w:p>
-        </w:tc>
-        <w:tc>
-          <w:tcPr/>
-          <w:p>
-            <w:pPr>
-              <w:pStyle w:val="Compact"/>
-            </w:pPr>
-          </w:p>
-        </w:tc>
-        <w:tc>
-          <w:tcPr/>
-          <w:p>
-            <w:pPr>
-              <w:pStyle w:val="Compact"/>
-            </w:pPr>
-          </w:p>
-        </w:tc>
-        <w:tc>
-          <w:tcPr/>
-          <w:p>
-            <w:pPr>
-              <w:pStyle w:val="Compact"/>
-            </w:pPr>
-          </w:p>
-        </w:tc>
-      </w:tr>
-      <w:tr>
-        <w:tc>
-          <w:tcPr/>
-          <w:p>
-            <w:pPr>
-              <w:pStyle w:val="Compact"/>
-              <w:jc w:val="left"/>
-            </w:pPr>
-            <w:r>
-              <w:t xml:space="preserve">SD (problem: (Intercept))</w:t>
-            </w:r>
-          </w:p>
-        </w:tc>
-        <w:tc>
-          <w:tcPr/>
-          <w:p>
-            <w:pPr>
-              <w:pStyle w:val="Compact"/>
-              <w:jc w:val="right"/>
-            </w:pPr>
-            <w:r>
-              <w:t xml:space="preserve">0.519</w:t>
+              <w:t xml:space="preserve">0.323</w:t>
             </w:r>
           </w:p>
         </w:tc>
@@ -16755,7 +16755,57 @@
               <w:jc w:val="right"/>
             </w:pPr>
             <w:r>
-              <w:t xml:space="preserve">48038</w:t>
+              <w:t xml:space="preserve">47632</w:t>
+            </w:r>
+          </w:p>
+        </w:tc>
+        <w:tc>
+          <w:tcPr/>
+          <w:p>
+            <w:pPr>
+              <w:pStyle w:val="Compact"/>
+            </w:pPr>
+          </w:p>
+        </w:tc>
+        <w:tc>
+          <w:tcPr/>
+          <w:p>
+            <w:pPr>
+              <w:pStyle w:val="Compact"/>
+            </w:pPr>
+          </w:p>
+        </w:tc>
+        <w:tc>
+          <w:tcPr/>
+          <w:p>
+            <w:pPr>
+              <w:pStyle w:val="Compact"/>
+            </w:pPr>
+          </w:p>
+        </w:tc>
+      </w:tr>
+      <w:tr>
+        <w:tc>
+          <w:tcPr/>
+          <w:p>
+            <w:pPr>
+              <w:pStyle w:val="Compact"/>
+              <w:jc w:val="left"/>
+            </w:pPr>
+            <w:r>
+              <w:t xml:space="preserve">N LabID</w:t>
+            </w:r>
+          </w:p>
+        </w:tc>
+        <w:tc>
+          <w:tcPr/>
+          <w:p>
+            <w:pPr>
+              <w:pStyle w:val="Compact"/>
+              <w:jc w:val="right"/>
+            </w:pPr>
+            <w:r>
+              <w:t xml:space="preserve">137</w:t>
             </w:r>
           </w:p>
         </w:tc>
@@ -16805,57 +16855,7 @@
               <w:jc w:val="right"/>
             </w:pPr>
             <w:r>
-              <w:t xml:space="preserve">53</w:t>
-            </w:r>
-          </w:p>
-        </w:tc>
-        <w:tc>
-          <w:tcPr/>
-          <w:p>
-            <w:pPr>
-              <w:pStyle w:val="Compact"/>
-            </w:pPr>
-          </w:p>
-        </w:tc>
-        <w:tc>
-          <w:tcPr/>
-          <w:p>
-            <w:pPr>
-              <w:pStyle w:val="Compact"/>
-            </w:pPr>
-          </w:p>
-        </w:tc>
-        <w:tc>
-          <w:tcPr/>
-          <w:p>
-            <w:pPr>
-              <w:pStyle w:val="Compact"/>
-            </w:pPr>
-          </w:p>
-        </w:tc>
-      </w:tr>
-      <w:tr>
-        <w:tc>
-          <w:tcPr/>
-          <w:p>
-            <w:pPr>
-              <w:pStyle w:val="Compact"/>
-              <w:jc w:val="left"/>
-            </w:pPr>
-            <w:r>
-              <w:t xml:space="preserve">N problem</w:t>
-            </w:r>
-          </w:p>
-        </w:tc>
-        <w:tc>
-          <w:tcPr/>
-          <w:p>
-            <w:pPr>
-              <w:pStyle w:val="Compact"/>
-              <w:jc w:val="right"/>
-            </w:pPr>
-            <w:r>
-              <w:t xml:space="preserve">6</w:t>
+              <w:t xml:space="preserve">52</w:t>
             </w:r>
           </w:p>
         </w:tc>
@@ -16910,11 +16910,11 @@
         <w:tblCaption w:val="Model for H2b and H3b (model with random intercepts for participating site); individidualistic countries."/>
       </w:tblPr>
       <w:tblGrid>
-        <w:gridCol w:w="3805"/>
-        <w:gridCol w:w="925"/>
-        <w:gridCol w:w="617"/>
-        <w:gridCol w:w="1748"/>
-        <w:gridCol w:w="822"/>
+        <w:gridCol w:w="3756"/>
+        <w:gridCol w:w="913"/>
+        <w:gridCol w:w="609"/>
+        <w:gridCol w:w="1827"/>
+        <w:gridCol w:w="812"/>
       </w:tblGrid>
       <w:tr>
         <w:trPr>
@@ -17002,19 +17002,19 @@
               <w:jc w:val="right"/>
             </w:pPr>
             <w:r>
-              <w:t xml:space="preserve">-0.340</w:t>
-            </w:r>
-          </w:p>
-        </w:tc>
-        <w:tc>
-          <w:tcPr/>
-          <w:p>
-            <w:pPr>
-              <w:pStyle w:val="Compact"/>
-              <w:jc w:val="right"/>
-            </w:pPr>
-            <w:r>
-              <w:t xml:space="preserve">0.237</w:t>
+              <w:t xml:space="preserve">-0.379</w:t>
+            </w:r>
+          </w:p>
+        </w:tc>
+        <w:tc>
+          <w:tcPr/>
+          <w:p>
+            <w:pPr>
+              <w:pStyle w:val="Compact"/>
+              <w:jc w:val="right"/>
+            </w:pPr>
+            <w:r>
+              <w:t xml:space="preserve">0.069</w:t>
             </w:r>
           </w:p>
         </w:tc>
@@ -17026,19 +17026,19 @@
               <w:jc w:val="center"/>
             </w:pPr>
             <w:r>
-              <w:t xml:space="preserve">[-0.804, 0.123]</w:t>
-            </w:r>
-          </w:p>
-        </w:tc>
-        <w:tc>
-          <w:tcPr/>
-          <w:p>
-            <w:pPr>
-              <w:pStyle w:val="Compact"/>
-              <w:jc w:val="right"/>
-            </w:pPr>
-            <w:r>
-              <w:t xml:space="preserve">.150</w:t>
+              <w:t xml:space="preserve">[-0.515, -0.244]</w:t>
+            </w:r>
+          </w:p>
+        </w:tc>
+        <w:tc>
+          <w:tcPr/>
+          <w:p>
+            <w:pPr>
+              <w:pStyle w:val="Compact"/>
+              <w:jc w:val="right"/>
+            </w:pPr>
+            <w:r>
+              <w:t xml:space="preserve">&lt; .001</w:t>
             </w:r>
           </w:p>
         </w:tc>
@@ -17064,7 +17064,7 @@
               <w:jc w:val="right"/>
             </w:pPr>
             <w:r>
-              <w:t xml:space="preserve">0.643</w:t>
+              <w:t xml:space="preserve">0.602</w:t>
             </w:r>
           </w:p>
         </w:tc>
@@ -17088,7 +17088,7 @@
               <w:jc w:val="center"/>
             </w:pPr>
             <w:r>
-              <w:t xml:space="preserve">[0.580, 0.706]</w:t>
+              <w:t xml:space="preserve">[0.540, 0.664]</w:t>
             </w:r>
           </w:p>
         </w:tc>
@@ -17126,19 +17126,19 @@
               <w:jc w:val="right"/>
             </w:pPr>
             <w:r>
-              <w:t xml:space="preserve">0.440</w:t>
-            </w:r>
-          </w:p>
-        </w:tc>
-        <w:tc>
-          <w:tcPr/>
-          <w:p>
-            <w:pPr>
-              <w:pStyle w:val="Compact"/>
-              <w:jc w:val="right"/>
-            </w:pPr>
-            <w:r>
-              <w:t xml:space="preserve">0.042</w:t>
+              <w:t xml:space="preserve">0.414</w:t>
+            </w:r>
+          </w:p>
+        </w:tc>
+        <w:tc>
+          <w:tcPr/>
+          <w:p>
+            <w:pPr>
+              <w:pStyle w:val="Compact"/>
+              <w:jc w:val="right"/>
+            </w:pPr>
+            <w:r>
+              <w:t xml:space="preserve">0.039</w:t>
             </w:r>
           </w:p>
         </w:tc>
@@ -17150,7 +17150,7 @@
               <w:jc w:val="center"/>
             </w:pPr>
             <w:r>
-              <w:t xml:space="preserve">[0.357, 0.523]</w:t>
+              <w:t xml:space="preserve">[0.337, 0.491]</w:t>
             </w:r>
           </w:p>
         </w:tc>
@@ -17188,19 +17188,19 @@
               <w:jc w:val="right"/>
             </w:pPr>
             <w:r>
-              <w:t xml:space="preserve">0.006</w:t>
-            </w:r>
-          </w:p>
-        </w:tc>
-        <w:tc>
-          <w:tcPr/>
-          <w:p>
-            <w:pPr>
-              <w:pStyle w:val="Compact"/>
-              <w:jc w:val="right"/>
-            </w:pPr>
-            <w:r>
-              <w:t xml:space="preserve">0.049</w:t>
+              <w:t xml:space="preserve">0.022</w:t>
+            </w:r>
+          </w:p>
+        </w:tc>
+        <w:tc>
+          <w:tcPr/>
+          <w:p>
+            <w:pPr>
+              <w:pStyle w:val="Compact"/>
+              <w:jc w:val="right"/>
+            </w:pPr>
+            <w:r>
+              <w:t xml:space="preserve">0.047</w:t>
             </w:r>
           </w:p>
         </w:tc>
@@ -17212,20 +17212,220 @@
               <w:jc w:val="center"/>
             </w:pPr>
             <w:r>
-              <w:t xml:space="preserve">[-0.090, 0.101]</w:t>
-            </w:r>
-          </w:p>
-        </w:tc>
-        <w:tc>
-          <w:tcPr/>
-          <w:p>
-            <w:pPr>
-              <w:pStyle w:val="Compact"/>
-              <w:jc w:val="right"/>
-            </w:pPr>
-            <w:r>
-              <w:t xml:space="preserve">.910</w:t>
-            </w:r>
+              <w:t xml:space="preserve">[-0.070, 0.115]</w:t>
+            </w:r>
+          </w:p>
+        </w:tc>
+        <w:tc>
+          <w:tcPr/>
+          <w:p>
+            <w:pPr>
+              <w:pStyle w:val="Compact"/>
+              <w:jc w:val="right"/>
+            </w:pPr>
+            <w:r>
+              <w:t xml:space="preserve">.632</w:t>
+            </w:r>
+          </w:p>
+        </w:tc>
+      </w:tr>
+      <w:tr>
+        <w:tc>
+          <w:tcPr/>
+          <w:p>
+            <w:pPr>
+              <w:pStyle w:val="Compact"/>
+              <w:jc w:val="left"/>
+            </w:pPr>
+            <w:r>
+              <w:t xml:space="preserve">SD (LabID: (Intercept))</w:t>
+            </w:r>
+          </w:p>
+        </w:tc>
+        <w:tc>
+          <w:tcPr/>
+          <w:p>
+            <w:pPr>
+              <w:pStyle w:val="Compact"/>
+              <w:jc w:val="right"/>
+            </w:pPr>
+            <w:r>
+              <w:t xml:space="preserve">0.320</w:t>
+            </w:r>
+          </w:p>
+        </w:tc>
+        <w:tc>
+          <w:tcPr/>
+          <w:p>
+            <w:pPr>
+              <w:pStyle w:val="Compact"/>
+            </w:pPr>
+          </w:p>
+        </w:tc>
+        <w:tc>
+          <w:tcPr/>
+          <w:p>
+            <w:pPr>
+              <w:pStyle w:val="Compact"/>
+            </w:pPr>
+          </w:p>
+        </w:tc>
+        <w:tc>
+          <w:tcPr/>
+          <w:p>
+            <w:pPr>
+              <w:pStyle w:val="Compact"/>
+            </w:pPr>
+          </w:p>
+        </w:tc>
+      </w:tr>
+      <w:tr>
+        <w:tc>
+          <w:tcPr/>
+          <w:p>
+            <w:pPr>
+              <w:pStyle w:val="Compact"/>
+              <w:jc w:val="left"/>
+            </w:pPr>
+            <w:r>
+              <w:t xml:space="preserve">SD (Country: feedback:justification)</w:t>
+            </w:r>
+          </w:p>
+        </w:tc>
+        <w:tc>
+          <w:tcPr/>
+          <w:p>
+            <w:pPr>
+              <w:pStyle w:val="Compact"/>
+              <w:jc w:val="right"/>
+            </w:pPr>
+            <w:r>
+              <w:t xml:space="preserve">0.041</w:t>
+            </w:r>
+          </w:p>
+        </w:tc>
+        <w:tc>
+          <w:tcPr/>
+          <w:p>
+            <w:pPr>
+              <w:pStyle w:val="Compact"/>
+            </w:pPr>
+          </w:p>
+        </w:tc>
+        <w:tc>
+          <w:tcPr/>
+          <w:p>
+            <w:pPr>
+              <w:pStyle w:val="Compact"/>
+            </w:pPr>
+          </w:p>
+        </w:tc>
+        <w:tc>
+          <w:tcPr/>
+          <w:p>
+            <w:pPr>
+              <w:pStyle w:val="Compact"/>
+            </w:pPr>
+          </w:p>
+        </w:tc>
+      </w:tr>
+      <w:tr>
+        <w:tc>
+          <w:tcPr/>
+          <w:p>
+            <w:pPr>
+              <w:pStyle w:val="Compact"/>
+              <w:jc w:val="left"/>
+            </w:pPr>
+            <w:r>
+              <w:t xml:space="preserve">SD (Country: justification)</w:t>
+            </w:r>
+          </w:p>
+        </w:tc>
+        <w:tc>
+          <w:tcPr/>
+          <w:p>
+            <w:pPr>
+              <w:pStyle w:val="Compact"/>
+              <w:jc w:val="right"/>
+            </w:pPr>
+            <w:r>
+              <w:t xml:space="preserve">0.098</w:t>
+            </w:r>
+          </w:p>
+        </w:tc>
+        <w:tc>
+          <w:tcPr/>
+          <w:p>
+            <w:pPr>
+              <w:pStyle w:val="Compact"/>
+            </w:pPr>
+          </w:p>
+        </w:tc>
+        <w:tc>
+          <w:tcPr/>
+          <w:p>
+            <w:pPr>
+              <w:pStyle w:val="Compact"/>
+            </w:pPr>
+          </w:p>
+        </w:tc>
+        <w:tc>
+          <w:tcPr/>
+          <w:p>
+            <w:pPr>
+              <w:pStyle w:val="Compact"/>
+            </w:pPr>
+          </w:p>
+        </w:tc>
+      </w:tr>
+      <w:tr>
+        <w:tc>
+          <w:tcPr/>
+          <w:p>
+            <w:pPr>
+              <w:pStyle w:val="Compact"/>
+              <w:jc w:val="left"/>
+            </w:pPr>
+            <w:r>
+              <w:t xml:space="preserve">SD (Country: feedback)</w:t>
+            </w:r>
+          </w:p>
+        </w:tc>
+        <w:tc>
+          <w:tcPr/>
+          <w:p>
+            <w:pPr>
+              <w:pStyle w:val="Compact"/>
+              <w:jc w:val="right"/>
+            </w:pPr>
+            <w:r>
+              <w:t xml:space="preserve">0.000</w:t>
+            </w:r>
+          </w:p>
+        </w:tc>
+        <w:tc>
+          <w:tcPr/>
+          <w:p>
+            <w:pPr>
+              <w:pStyle w:val="Compact"/>
+            </w:pPr>
+          </w:p>
+        </w:tc>
+        <w:tc>
+          <w:tcPr/>
+          <w:p>
+            <w:pPr>
+              <w:pStyle w:val="Compact"/>
+            </w:pPr>
+          </w:p>
+        </w:tc>
+        <w:tc>
+          <w:tcPr/>
+          <w:p>
+            <w:pPr>
+              <w:pStyle w:val="Compact"/>
+            </w:pPr>
           </w:p>
         </w:tc>
       </w:tr>
@@ -17250,207 +17450,7 @@
               <w:jc w:val="right"/>
             </w:pPr>
             <w:r>
-              <w:t xml:space="preserve">0.387</w:t>
-            </w:r>
-          </w:p>
-        </w:tc>
-        <w:tc>
-          <w:tcPr/>
-          <w:p>
-            <w:pPr>
-              <w:pStyle w:val="Compact"/>
-            </w:pPr>
-          </w:p>
-        </w:tc>
-        <w:tc>
-          <w:tcPr/>
-          <w:p>
-            <w:pPr>
-              <w:pStyle w:val="Compact"/>
-            </w:pPr>
-          </w:p>
-        </w:tc>
-        <w:tc>
-          <w:tcPr/>
-          <w:p>
-            <w:pPr>
-              <w:pStyle w:val="Compact"/>
-            </w:pPr>
-          </w:p>
-        </w:tc>
-      </w:tr>
-      <w:tr>
-        <w:tc>
-          <w:tcPr/>
-          <w:p>
-            <w:pPr>
-              <w:pStyle w:val="Compact"/>
-              <w:jc w:val="left"/>
-            </w:pPr>
-            <w:r>
-              <w:t xml:space="preserve">SD (Country: feedback)</w:t>
-            </w:r>
-          </w:p>
-        </w:tc>
-        <w:tc>
-          <w:tcPr/>
-          <w:p>
-            <w:pPr>
-              <w:pStyle w:val="Compact"/>
-              <w:jc w:val="right"/>
-            </w:pPr>
-            <w:r>
-              <w:t xml:space="preserve">0.000</w:t>
-            </w:r>
-          </w:p>
-        </w:tc>
-        <w:tc>
-          <w:tcPr/>
-          <w:p>
-            <w:pPr>
-              <w:pStyle w:val="Compact"/>
-            </w:pPr>
-          </w:p>
-        </w:tc>
-        <w:tc>
-          <w:tcPr/>
-          <w:p>
-            <w:pPr>
-              <w:pStyle w:val="Compact"/>
-            </w:pPr>
-          </w:p>
-        </w:tc>
-        <w:tc>
-          <w:tcPr/>
-          <w:p>
-            <w:pPr>
-              <w:pStyle w:val="Compact"/>
-            </w:pPr>
-          </w:p>
-        </w:tc>
-      </w:tr>
-      <w:tr>
-        <w:tc>
-          <w:tcPr/>
-          <w:p>
-            <w:pPr>
-              <w:pStyle w:val="Compact"/>
-              <w:jc w:val="left"/>
-            </w:pPr>
-            <w:r>
-              <w:t xml:space="preserve">SD (Country: justification)</w:t>
-            </w:r>
-          </w:p>
-        </w:tc>
-        <w:tc>
-          <w:tcPr/>
-          <w:p>
-            <w:pPr>
-              <w:pStyle w:val="Compact"/>
-              <w:jc w:val="right"/>
-            </w:pPr>
-            <w:r>
-              <w:t xml:space="preserve">0.122</w:t>
-            </w:r>
-          </w:p>
-        </w:tc>
-        <w:tc>
-          <w:tcPr/>
-          <w:p>
-            <w:pPr>
-              <w:pStyle w:val="Compact"/>
-            </w:pPr>
-          </w:p>
-        </w:tc>
-        <w:tc>
-          <w:tcPr/>
-          <w:p>
-            <w:pPr>
-              <w:pStyle w:val="Compact"/>
-            </w:pPr>
-          </w:p>
-        </w:tc>
-        <w:tc>
-          <w:tcPr/>
-          <w:p>
-            <w:pPr>
-              <w:pStyle w:val="Compact"/>
-            </w:pPr>
-          </w:p>
-        </w:tc>
-      </w:tr>
-      <w:tr>
-        <w:tc>
-          <w:tcPr/>
-          <w:p>
-            <w:pPr>
-              <w:pStyle w:val="Compact"/>
-              <w:jc w:val="left"/>
-            </w:pPr>
-            <w:r>
-              <w:t xml:space="preserve">SD (Country: feedback:justification)</w:t>
-            </w:r>
-          </w:p>
-        </w:tc>
-        <w:tc>
-          <w:tcPr/>
-          <w:p>
-            <w:pPr>
-              <w:pStyle w:val="Compact"/>
-              <w:jc w:val="right"/>
-            </w:pPr>
-            <w:r>
-              <w:t xml:space="preserve">0.058</w:t>
-            </w:r>
-          </w:p>
-        </w:tc>
-        <w:tc>
-          <w:tcPr/>
-          <w:p>
-            <w:pPr>
-              <w:pStyle w:val="Compact"/>
-            </w:pPr>
-          </w:p>
-        </w:tc>
-        <w:tc>
-          <w:tcPr/>
-          <w:p>
-            <w:pPr>
-              <w:pStyle w:val="Compact"/>
-            </w:pPr>
-          </w:p>
-        </w:tc>
-        <w:tc>
-          <w:tcPr/>
-          <w:p>
-            <w:pPr>
-              <w:pStyle w:val="Compact"/>
-            </w:pPr>
-          </w:p>
-        </w:tc>
-      </w:tr>
-      <w:tr>
-        <w:tc>
-          <w:tcPr/>
-          <w:p>
-            <w:pPr>
-              <w:pStyle w:val="Compact"/>
-              <w:jc w:val="left"/>
-            </w:pPr>
-            <w:r>
-              <w:t xml:space="preserve">SD (problem: (Intercept))</w:t>
-            </w:r>
-          </w:p>
-        </w:tc>
-        <w:tc>
-          <w:tcPr/>
-          <w:p>
-            <w:pPr>
-              <w:pStyle w:val="Compact"/>
-              <w:jc w:val="right"/>
-            </w:pPr>
-            <w:r>
-              <w:t xml:space="preserve">0.553</w:t>
+              <w:t xml:space="preserve">0.268</w:t>
             </w:r>
           </w:p>
         </w:tc>
@@ -17500,7 +17500,57 @@
               <w:jc w:val="right"/>
             </w:pPr>
             <w:r>
-              <w:t xml:space="preserve">33989</w:t>
+              <w:t xml:space="preserve">33604</w:t>
+            </w:r>
+          </w:p>
+        </w:tc>
+        <w:tc>
+          <w:tcPr/>
+          <w:p>
+            <w:pPr>
+              <w:pStyle w:val="Compact"/>
+            </w:pPr>
+          </w:p>
+        </w:tc>
+        <w:tc>
+          <w:tcPr/>
+          <w:p>
+            <w:pPr>
+              <w:pStyle w:val="Compact"/>
+            </w:pPr>
+          </w:p>
+        </w:tc>
+        <w:tc>
+          <w:tcPr/>
+          <w:p>
+            <w:pPr>
+              <w:pStyle w:val="Compact"/>
+            </w:pPr>
+          </w:p>
+        </w:tc>
+      </w:tr>
+      <w:tr>
+        <w:tc>
+          <w:tcPr/>
+          <w:p>
+            <w:pPr>
+              <w:pStyle w:val="Compact"/>
+              <w:jc w:val="left"/>
+            </w:pPr>
+            <w:r>
+              <w:t xml:space="preserve">N LabID</w:t>
+            </w:r>
+          </w:p>
+        </w:tc>
+        <w:tc>
+          <w:tcPr/>
+          <w:p>
+            <w:pPr>
+              <w:pStyle w:val="Compact"/>
+              <w:jc w:val="right"/>
+            </w:pPr>
+            <w:r>
+              <w:t xml:space="preserve">95</w:t>
             </w:r>
           </w:p>
         </w:tc>
@@ -17550,57 +17600,7 @@
               <w:jc w:val="right"/>
             </w:pPr>
             <w:r>
-              <w:t xml:space="preserve">31</w:t>
-            </w:r>
-          </w:p>
-        </w:tc>
-        <w:tc>
-          <w:tcPr/>
-          <w:p>
-            <w:pPr>
-              <w:pStyle w:val="Compact"/>
-            </w:pPr>
-          </w:p>
-        </w:tc>
-        <w:tc>
-          <w:tcPr/>
-          <w:p>
-            <w:pPr>
-              <w:pStyle w:val="Compact"/>
-            </w:pPr>
-          </w:p>
-        </w:tc>
-        <w:tc>
-          <w:tcPr/>
-          <w:p>
-            <w:pPr>
-              <w:pStyle w:val="Compact"/>
-            </w:pPr>
-          </w:p>
-        </w:tc>
-      </w:tr>
-      <w:tr>
-        <w:tc>
-          <w:tcPr/>
-          <w:p>
-            <w:pPr>
-              <w:pStyle w:val="Compact"/>
-              <w:jc w:val="left"/>
-            </w:pPr>
-            <w:r>
-              <w:t xml:space="preserve">N problem</w:t>
-            </w:r>
-          </w:p>
-        </w:tc>
-        <w:tc>
-          <w:tcPr/>
-          <w:p>
-            <w:pPr>
-              <w:pStyle w:val="Compact"/>
-              <w:jc w:val="right"/>
-            </w:pPr>
-            <w:r>
-              <w:t xml:space="preserve">6</w:t>
+              <w:t xml:space="preserve">30</w:t>
             </w:r>
           </w:p>
         </w:tc>
@@ -17739,19 +17739,19 @@
               <w:jc w:val="right"/>
             </w:pPr>
             <w:r>
-              <w:t xml:space="preserve">-0.816</w:t>
-            </w:r>
-          </w:p>
-        </w:tc>
-        <w:tc>
-          <w:tcPr/>
-          <w:p>
-            <w:pPr>
-              <w:pStyle w:val="Compact"/>
-              <w:jc w:val="right"/>
-            </w:pPr>
-            <w:r>
-              <w:t xml:space="preserve">0.235</w:t>
+              <w:t xml:space="preserve">-0.774</w:t>
+            </w:r>
+          </w:p>
+        </w:tc>
+        <w:tc>
+          <w:tcPr/>
+          <w:p>
+            <w:pPr>
+              <w:pStyle w:val="Compact"/>
+              <w:jc w:val="right"/>
+            </w:pPr>
+            <w:r>
+              <w:t xml:space="preserve">0.111</w:t>
             </w:r>
           </w:p>
         </w:tc>
@@ -17763,7 +17763,7 @@
               <w:jc w:val="center"/>
             </w:pPr>
             <w:r>
-              <w:t xml:space="preserve">[-1.277, -0.355]</w:t>
+              <w:t xml:space="preserve">[-0.991, -0.557]</w:t>
             </w:r>
           </w:p>
         </w:tc>
@@ -17801,19 +17801,19 @@
               <w:jc w:val="right"/>
             </w:pPr>
             <w:r>
-              <w:t xml:space="preserve">0.637</w:t>
-            </w:r>
-          </w:p>
-        </w:tc>
-        <w:tc>
-          <w:tcPr/>
-          <w:p>
-            <w:pPr>
-              <w:pStyle w:val="Compact"/>
-              <w:jc w:val="right"/>
-            </w:pPr>
-            <w:r>
-              <w:t xml:space="preserve">0.060</w:t>
+              <w:t xml:space="preserve">0.597</w:t>
+            </w:r>
+          </w:p>
+        </w:tc>
+        <w:tc>
+          <w:tcPr/>
+          <w:p>
+            <w:pPr>
+              <w:pStyle w:val="Compact"/>
+              <w:jc w:val="right"/>
+            </w:pPr>
+            <w:r>
+              <w:t xml:space="preserve">0.050</w:t>
             </w:r>
           </w:p>
         </w:tc>
@@ -17825,7 +17825,7 @@
               <w:jc w:val="center"/>
             </w:pPr>
             <w:r>
-              <w:t xml:space="preserve">[0.520, 0.754]</w:t>
+              <w:t xml:space="preserve">[0.499, 0.695]</w:t>
             </w:r>
           </w:p>
         </w:tc>
@@ -17863,19 +17863,19 @@
               <w:jc w:val="right"/>
             </w:pPr>
             <w:r>
-              <w:t xml:space="preserve">0.385</w:t>
-            </w:r>
-          </w:p>
-        </w:tc>
-        <w:tc>
-          <w:tcPr/>
-          <w:p>
-            <w:pPr>
-              <w:pStyle w:val="Compact"/>
-              <w:jc w:val="right"/>
-            </w:pPr>
-            <w:r>
-              <w:t xml:space="preserve">0.071</w:t>
+              <w:t xml:space="preserve">0.364</w:t>
+            </w:r>
+          </w:p>
+        </w:tc>
+        <w:tc>
+          <w:tcPr/>
+          <w:p>
+            <w:pPr>
+              <w:pStyle w:val="Compact"/>
+              <w:jc w:val="right"/>
+            </w:pPr>
+            <w:r>
+              <w:t xml:space="preserve">0.066</w:t>
             </w:r>
           </w:p>
         </w:tc>
@@ -17887,7 +17887,7 @@
               <w:jc w:val="center"/>
             </w:pPr>
             <w:r>
-              <w:t xml:space="preserve">[0.246, 0.525]</w:t>
+              <w:t xml:space="preserve">[0.235, 0.494]</w:t>
             </w:r>
           </w:p>
         </w:tc>
@@ -17925,19 +17925,19 @@
               <w:jc w:val="right"/>
             </w:pPr>
             <w:r>
-              <w:t xml:space="preserve">-0.168</w:t>
-            </w:r>
-          </w:p>
-        </w:tc>
-        <w:tc>
-          <w:tcPr/>
-          <w:p>
-            <w:pPr>
-              <w:pStyle w:val="Compact"/>
-              <w:jc w:val="right"/>
-            </w:pPr>
-            <w:r>
-              <w:t xml:space="preserve">0.097</w:t>
+              <w:t xml:space="preserve">-0.161</w:t>
+            </w:r>
+          </w:p>
+        </w:tc>
+        <w:tc>
+          <w:tcPr/>
+          <w:p>
+            <w:pPr>
+              <w:pStyle w:val="Compact"/>
+              <w:jc w:val="right"/>
+            </w:pPr>
+            <w:r>
+              <w:t xml:space="preserve">0.091</w:t>
             </w:r>
           </w:p>
         </w:tc>
@@ -17949,20 +17949,220 @@
               <w:jc w:val="center"/>
             </w:pPr>
             <w:r>
-              <w:t xml:space="preserve">[-0.359, 0.023]</w:t>
-            </w:r>
-          </w:p>
-        </w:tc>
-        <w:tc>
-          <w:tcPr/>
-          <w:p>
-            <w:pPr>
-              <w:pStyle w:val="Compact"/>
-              <w:jc w:val="right"/>
-            </w:pPr>
-            <w:r>
-              <w:t xml:space="preserve">.085</w:t>
-            </w:r>
+              <w:t xml:space="preserve">[-0.340, 0.018]</w:t>
+            </w:r>
+          </w:p>
+        </w:tc>
+        <w:tc>
+          <w:tcPr/>
+          <w:p>
+            <w:pPr>
+              <w:pStyle w:val="Compact"/>
+              <w:jc w:val="right"/>
+            </w:pPr>
+            <w:r>
+              <w:t xml:space="preserve">.078</w:t>
+            </w:r>
+          </w:p>
+        </w:tc>
+      </w:tr>
+      <w:tr>
+        <w:tc>
+          <w:tcPr/>
+          <w:p>
+            <w:pPr>
+              <w:pStyle w:val="Compact"/>
+              <w:jc w:val="left"/>
+            </w:pPr>
+            <w:r>
+              <w:t xml:space="preserve">SD (LabID: (Intercept))</w:t>
+            </w:r>
+          </w:p>
+        </w:tc>
+        <w:tc>
+          <w:tcPr/>
+          <w:p>
+            <w:pPr>
+              <w:pStyle w:val="Compact"/>
+              <w:jc w:val="right"/>
+            </w:pPr>
+            <w:r>
+              <w:t xml:space="preserve">0.483</w:t>
+            </w:r>
+          </w:p>
+        </w:tc>
+        <w:tc>
+          <w:tcPr/>
+          <w:p>
+            <w:pPr>
+              <w:pStyle w:val="Compact"/>
+            </w:pPr>
+          </w:p>
+        </w:tc>
+        <w:tc>
+          <w:tcPr/>
+          <w:p>
+            <w:pPr>
+              <w:pStyle w:val="Compact"/>
+            </w:pPr>
+          </w:p>
+        </w:tc>
+        <w:tc>
+          <w:tcPr/>
+          <w:p>
+            <w:pPr>
+              <w:pStyle w:val="Compact"/>
+            </w:pPr>
+          </w:p>
+        </w:tc>
+      </w:tr>
+      <w:tr>
+        <w:tc>
+          <w:tcPr/>
+          <w:p>
+            <w:pPr>
+              <w:pStyle w:val="Compact"/>
+              <w:jc w:val="left"/>
+            </w:pPr>
+            <w:r>
+              <w:t xml:space="preserve">SD (Country: feedback:justification)</w:t>
+            </w:r>
+          </w:p>
+        </w:tc>
+        <w:tc>
+          <w:tcPr/>
+          <w:p>
+            <w:pPr>
+              <w:pStyle w:val="Compact"/>
+              <w:jc w:val="right"/>
+            </w:pPr>
+            <w:r>
+              <w:t xml:space="preserve">0.213</w:t>
+            </w:r>
+          </w:p>
+        </w:tc>
+        <w:tc>
+          <w:tcPr/>
+          <w:p>
+            <w:pPr>
+              <w:pStyle w:val="Compact"/>
+            </w:pPr>
+          </w:p>
+        </w:tc>
+        <w:tc>
+          <w:tcPr/>
+          <w:p>
+            <w:pPr>
+              <w:pStyle w:val="Compact"/>
+            </w:pPr>
+          </w:p>
+        </w:tc>
+        <w:tc>
+          <w:tcPr/>
+          <w:p>
+            <w:pPr>
+              <w:pStyle w:val="Compact"/>
+            </w:pPr>
+          </w:p>
+        </w:tc>
+      </w:tr>
+      <w:tr>
+        <w:tc>
+          <w:tcPr/>
+          <w:p>
+            <w:pPr>
+              <w:pStyle w:val="Compact"/>
+              <w:jc w:val="left"/>
+            </w:pPr>
+            <w:r>
+              <w:t xml:space="preserve">SD (Country: justification)</w:t>
+            </w:r>
+          </w:p>
+        </w:tc>
+        <w:tc>
+          <w:tcPr/>
+          <w:p>
+            <w:pPr>
+              <w:pStyle w:val="Compact"/>
+              <w:jc w:val="right"/>
+            </w:pPr>
+            <w:r>
+              <w:t xml:space="preserve">0.148</w:t>
+            </w:r>
+          </w:p>
+        </w:tc>
+        <w:tc>
+          <w:tcPr/>
+          <w:p>
+            <w:pPr>
+              <w:pStyle w:val="Compact"/>
+            </w:pPr>
+          </w:p>
+        </w:tc>
+        <w:tc>
+          <w:tcPr/>
+          <w:p>
+            <w:pPr>
+              <w:pStyle w:val="Compact"/>
+            </w:pPr>
+          </w:p>
+        </w:tc>
+        <w:tc>
+          <w:tcPr/>
+          <w:p>
+            <w:pPr>
+              <w:pStyle w:val="Compact"/>
+            </w:pPr>
+          </w:p>
+        </w:tc>
+      </w:tr>
+      <w:tr>
+        <w:tc>
+          <w:tcPr/>
+          <w:p>
+            <w:pPr>
+              <w:pStyle w:val="Compact"/>
+              <w:jc w:val="left"/>
+            </w:pPr>
+            <w:r>
+              <w:t xml:space="preserve">SD (Country: feedback)</w:t>
+            </w:r>
+          </w:p>
+        </w:tc>
+        <w:tc>
+          <w:tcPr/>
+          <w:p>
+            <w:pPr>
+              <w:pStyle w:val="Compact"/>
+              <w:jc w:val="right"/>
+            </w:pPr>
+            <w:r>
+              <w:t xml:space="preserve">0.000</w:t>
+            </w:r>
+          </w:p>
+        </w:tc>
+        <w:tc>
+          <w:tcPr/>
+          <w:p>
+            <w:pPr>
+              <w:pStyle w:val="Compact"/>
+            </w:pPr>
+          </w:p>
+        </w:tc>
+        <w:tc>
+          <w:tcPr/>
+          <w:p>
+            <w:pPr>
+              <w:pStyle w:val="Compact"/>
+            </w:pPr>
+          </w:p>
+        </w:tc>
+        <w:tc>
+          <w:tcPr/>
+          <w:p>
+            <w:pPr>
+              <w:pStyle w:val="Compact"/>
+            </w:pPr>
           </w:p>
         </w:tc>
       </w:tr>
@@ -17987,207 +18187,7 @@
               <w:jc w:val="right"/>
             </w:pPr>
             <w:r>
-              <w:t xml:space="preserve">0.518</w:t>
-            </w:r>
-          </w:p>
-        </w:tc>
-        <w:tc>
-          <w:tcPr/>
-          <w:p>
-            <w:pPr>
-              <w:pStyle w:val="Compact"/>
-            </w:pPr>
-          </w:p>
-        </w:tc>
-        <w:tc>
-          <w:tcPr/>
-          <w:p>
-            <w:pPr>
-              <w:pStyle w:val="Compact"/>
-            </w:pPr>
-          </w:p>
-        </w:tc>
-        <w:tc>
-          <w:tcPr/>
-          <w:p>
-            <w:pPr>
-              <w:pStyle w:val="Compact"/>
-            </w:pPr>
-          </w:p>
-        </w:tc>
-      </w:tr>
-      <w:tr>
-        <w:tc>
-          <w:tcPr/>
-          <w:p>
-            <w:pPr>
-              <w:pStyle w:val="Compact"/>
-              <w:jc w:val="left"/>
-            </w:pPr>
-            <w:r>
-              <w:t xml:space="preserve">SD (Country: feedback)</w:t>
-            </w:r>
-          </w:p>
-        </w:tc>
-        <w:tc>
-          <w:tcPr/>
-          <w:p>
-            <w:pPr>
-              <w:pStyle w:val="Compact"/>
-              <w:jc w:val="right"/>
-            </w:pPr>
-            <w:r>
-              <w:t xml:space="preserve">0.077</w:t>
-            </w:r>
-          </w:p>
-        </w:tc>
-        <w:tc>
-          <w:tcPr/>
-          <w:p>
-            <w:pPr>
-              <w:pStyle w:val="Compact"/>
-            </w:pPr>
-          </w:p>
-        </w:tc>
-        <w:tc>
-          <w:tcPr/>
-          <w:p>
-            <w:pPr>
-              <w:pStyle w:val="Compact"/>
-            </w:pPr>
-          </w:p>
-        </w:tc>
-        <w:tc>
-          <w:tcPr/>
-          <w:p>
-            <w:pPr>
-              <w:pStyle w:val="Compact"/>
-            </w:pPr>
-          </w:p>
-        </w:tc>
-      </w:tr>
-      <w:tr>
-        <w:tc>
-          <w:tcPr/>
-          <w:p>
-            <w:pPr>
-              <w:pStyle w:val="Compact"/>
-              <w:jc w:val="left"/>
-            </w:pPr>
-            <w:r>
-              <w:t xml:space="preserve">SD (Country: justification)</w:t>
-            </w:r>
-          </w:p>
-        </w:tc>
-        <w:tc>
-          <w:tcPr/>
-          <w:p>
-            <w:pPr>
-              <w:pStyle w:val="Compact"/>
-              <w:jc w:val="right"/>
-            </w:pPr>
-            <w:r>
-              <w:t xml:space="preserve">0.170</w:t>
-            </w:r>
-          </w:p>
-        </w:tc>
-        <w:tc>
-          <w:tcPr/>
-          <w:p>
-            <w:pPr>
-              <w:pStyle w:val="Compact"/>
-            </w:pPr>
-          </w:p>
-        </w:tc>
-        <w:tc>
-          <w:tcPr/>
-          <w:p>
-            <w:pPr>
-              <w:pStyle w:val="Compact"/>
-            </w:pPr>
-          </w:p>
-        </w:tc>
-        <w:tc>
-          <w:tcPr/>
-          <w:p>
-            <w:pPr>
-              <w:pStyle w:val="Compact"/>
-            </w:pPr>
-          </w:p>
-        </w:tc>
-      </w:tr>
-      <w:tr>
-        <w:tc>
-          <w:tcPr/>
-          <w:p>
-            <w:pPr>
-              <w:pStyle w:val="Compact"/>
-              <w:jc w:val="left"/>
-            </w:pPr>
-            <w:r>
-              <w:t xml:space="preserve">SD (Country: feedback:justification)</w:t>
-            </w:r>
-          </w:p>
-        </w:tc>
-        <w:tc>
-          <w:tcPr/>
-          <w:p>
-            <w:pPr>
-              <w:pStyle w:val="Compact"/>
-              <w:jc w:val="right"/>
-            </w:pPr>
-            <w:r>
-              <w:t xml:space="preserve">0.231</w:t>
-            </w:r>
-          </w:p>
-        </w:tc>
-        <w:tc>
-          <w:tcPr/>
-          <w:p>
-            <w:pPr>
-              <w:pStyle w:val="Compact"/>
-            </w:pPr>
-          </w:p>
-        </w:tc>
-        <w:tc>
-          <w:tcPr/>
-          <w:p>
-            <w:pPr>
-              <w:pStyle w:val="Compact"/>
-            </w:pPr>
-          </w:p>
-        </w:tc>
-        <w:tc>
-          <w:tcPr/>
-          <w:p>
-            <w:pPr>
-              <w:pStyle w:val="Compact"/>
-            </w:pPr>
-          </w:p>
-        </w:tc>
-      </w:tr>
-      <w:tr>
-        <w:tc>
-          <w:tcPr/>
-          <w:p>
-            <w:pPr>
-              <w:pStyle w:val="Compact"/>
-              <w:jc w:val="left"/>
-            </w:pPr>
-            <w:r>
-              <w:t xml:space="preserve">SD (problem: (Intercept))</w:t>
-            </w:r>
-          </w:p>
-        </w:tc>
-        <w:tc>
-          <w:tcPr/>
-          <w:p>
-            <w:pPr>
-              <w:pStyle w:val="Compact"/>
-              <w:jc w:val="right"/>
-            </w:pPr>
-            <w:r>
-              <w:t xml:space="preserve">0.494</w:t>
+              <w:t xml:space="preserve">0.225</w:t>
             </w:r>
           </w:p>
         </w:tc>
@@ -18237,7 +18237,57 @@
               <w:jc w:val="right"/>
             </w:pPr>
             <w:r>
-              <w:t xml:space="preserve">14049</w:t>
+              <w:t xml:space="preserve">14028</w:t>
+            </w:r>
+          </w:p>
+        </w:tc>
+        <w:tc>
+          <w:tcPr/>
+          <w:p>
+            <w:pPr>
+              <w:pStyle w:val="Compact"/>
+            </w:pPr>
+          </w:p>
+        </w:tc>
+        <w:tc>
+          <w:tcPr/>
+          <w:p>
+            <w:pPr>
+              <w:pStyle w:val="Compact"/>
+            </w:pPr>
+          </w:p>
+        </w:tc>
+        <w:tc>
+          <w:tcPr/>
+          <w:p>
+            <w:pPr>
+              <w:pStyle w:val="Compact"/>
+            </w:pPr>
+          </w:p>
+        </w:tc>
+      </w:tr>
+      <w:tr>
+        <w:tc>
+          <w:tcPr/>
+          <w:p>
+            <w:pPr>
+              <w:pStyle w:val="Compact"/>
+              <w:jc w:val="left"/>
+            </w:pPr>
+            <w:r>
+              <w:t xml:space="preserve">N LabID</w:t>
+            </w:r>
+          </w:p>
+        </w:tc>
+        <w:tc>
+          <w:tcPr/>
+          <w:p>
+            <w:pPr>
+              <w:pStyle w:val="Compact"/>
+              <w:jc w:val="right"/>
+            </w:pPr>
+            <w:r>
+              <w:t xml:space="preserve">43</w:t>
             </w:r>
           </w:p>
         </w:tc>
@@ -18288,56 +18338,6 @@
             </w:pPr>
             <w:r>
               <w:t xml:space="preserve">22</w:t>
-            </w:r>
-          </w:p>
-        </w:tc>
-        <w:tc>
-          <w:tcPr/>
-          <w:p>
-            <w:pPr>
-              <w:pStyle w:val="Compact"/>
-            </w:pPr>
-          </w:p>
-        </w:tc>
-        <w:tc>
-          <w:tcPr/>
-          <w:p>
-            <w:pPr>
-              <w:pStyle w:val="Compact"/>
-            </w:pPr>
-          </w:p>
-        </w:tc>
-        <w:tc>
-          <w:tcPr/>
-          <w:p>
-            <w:pPr>
-              <w:pStyle w:val="Compact"/>
-            </w:pPr>
-          </w:p>
-        </w:tc>
-      </w:tr>
-      <w:tr>
-        <w:tc>
-          <w:tcPr/>
-          <w:p>
-            <w:pPr>
-              <w:pStyle w:val="Compact"/>
-              <w:jc w:val="left"/>
-            </w:pPr>
-            <w:r>
-              <w:t xml:space="preserve">N problem</w:t>
-            </w:r>
-          </w:p>
-        </w:tc>
-        <w:tc>
-          <w:tcPr/>
-          <w:p>
-            <w:pPr>
-              <w:pStyle w:val="Compact"/>
-              <w:jc w:val="right"/>
-            </w:pPr>
-            <w:r>
-              <w:t xml:space="preserve">6</w:t>
             </w:r>
           </w:p>
         </w:tc>

</xml_diff>

<commit_message>
added measurement invariance analysis of intellectual humility scale
</commit_message>
<xml_diff>
--- a/analysis-code/results.docx
+++ b/analysis-code/results.docx
@@ -21,7 +21,7 @@
         <w:pStyle w:val="Date"/>
       </w:pPr>
       <w:r>
-        <w:t xml:space="preserve">2026-08-24</w:t>
+        <w:t xml:space="preserve">2026-09-03</w:t>
       </w:r>
     </w:p>
     <w:p>
@@ -29,7 +29,7 @@
         <w:br w:type="page"/>
       </w:r>
     </w:p>
-    <w:bookmarkStart w:id="67" w:name="results"/>
+    <w:bookmarkStart w:id="69" w:name="results"/>
     <w:p>
       <w:pPr>
         <w:pStyle w:val="Heading1"/>
@@ -18765,7 +18765,7 @@
     <w:bookmarkEnd w:id="35"/>
     <w:bookmarkEnd w:id="36"/>
     <w:bookmarkEnd w:id="37"/>
-    <w:bookmarkStart w:id="66" w:name="exploratory-analyses"/>
+    <w:bookmarkStart w:id="68" w:name="exploratory-analyses"/>
     <w:p>
       <w:pPr>
         <w:pStyle w:val="Heading2"/>
@@ -18774,13 +18774,2058 @@
         <w:t xml:space="preserve">1.4 Exploratory Analyses</w:t>
       </w:r>
     </w:p>
-    <w:bookmarkStart w:id="38" w:name="X715d53ed7a3146640af0b1534337bb41a21f168"/>
+    <w:bookmarkStart w:id="39" w:name="Xb93f2b75b28b47f87e65e047c9dd8bb7e61497d"/>
     <w:p>
       <w:pPr>
         <w:pStyle w:val="Heading3"/>
       </w:pPr>
       <w:r>
-        <w:t xml:space="preserve">1.4.1 Individual Differences and Corrective Behaviour</w:t>
+        <w:t xml:space="preserve">1.4.1 Scales reliability and measurement invariance</w:t>
+      </w:r>
+    </w:p>
+    <w:p>
+      <w:pPr>
+        <w:pStyle w:val="FirstParagraph"/>
+      </w:pPr>
+      <w:r>
+        <w:t xml:space="preserve">Note: for these analyses I have included only countries with N</w:t>
+      </w:r>
+      <w:r>
+        <w:t xml:space="preserve"> </w:t>
+      </w:r>
+      <m:oMath>
+        <m:r>
+          <m:rPr>
+            <m:sty m:val="p"/>
+          </m:rPr>
+          <m:t>≥</m:t>
+        </m:r>
+      </m:oMath>
+      <w:r>
+        <w:t xml:space="preserve"> </w:t>
+      </w:r>
+      <w:r>
+        <w:t xml:space="preserve">100.</w:t>
+      </w:r>
+    </w:p>
+    <w:bookmarkStart w:id="38" w:name="intellectual-humility"/>
+    <w:p>
+      <w:pPr>
+        <w:pStyle w:val="Heading4"/>
+      </w:pPr>
+      <w:r>
+        <w:t xml:space="preserve">1.4.1.1 Intellectual humility</w:t>
+      </w:r>
+    </w:p>
+    <w:p>
+      <w:pPr>
+        <w:pStyle w:val="TableCaption"/>
+      </w:pPr>
+      <w:r>
+        <w:t xml:space="preserve">Internal consistency of the Intellectual Humility scale by country (only countries with N&gt;100 shown).</w:t>
+      </w:r>
+    </w:p>
+    <w:tbl>
+      <w:tblPr>
+        <w:tblStyle w:val="Table"/>
+        <w:tblW w:type="auto" w:w="0"/>
+        <w:tblLook w:firstRow="1" w:lastRow="0" w:firstColumn="0" w:lastColumn="0" w:noHBand="0" w:noVBand="0" w:val="0020"/>
+        <w:tblCaption w:val="Internal consistency of the Intellectual Humility scale by country (only countries with N&gt;100 shown)."/>
+      </w:tblPr>
+      <w:tblGrid>
+        <w:gridCol w:w="2640"/>
+        <w:gridCol w:w="2640"/>
+        <w:gridCol w:w="2640"/>
+      </w:tblGrid>
+      <w:tr>
+        <w:trPr>
+          <w:tblHeader w:val="on"/>
+        </w:trPr>
+        <w:tc>
+          <w:tcPr/>
+          <w:p>
+            <w:pPr>
+              <w:pStyle w:val="Compact"/>
+              <w:jc w:val="left"/>
+            </w:pPr>
+            <w:r>
+              <w:t xml:space="preserve">Country</w:t>
+            </w:r>
+          </w:p>
+        </w:tc>
+        <w:tc>
+          <w:tcPr/>
+          <w:p>
+            <w:pPr>
+              <w:pStyle w:val="Compact"/>
+              <w:jc w:val="right"/>
+            </w:pPr>
+            <w:r>
+              <w:t xml:space="preserve">N</w:t>
+            </w:r>
+          </w:p>
+        </w:tc>
+        <w:tc>
+          <w:tcPr/>
+          <w:p>
+            <w:pPr>
+              <w:pStyle w:val="Compact"/>
+              <w:jc w:val="right"/>
+            </w:pPr>
+            <w:r>
+              <w:t xml:space="preserve">alpha</w:t>
+            </w:r>
+          </w:p>
+        </w:tc>
+      </w:tr>
+      <w:tr>
+        <w:tc>
+          <w:tcPr/>
+          <w:p>
+            <w:pPr>
+              <w:pStyle w:val="Compact"/>
+              <w:jc w:val="left"/>
+            </w:pPr>
+            <w:r>
+              <w:t xml:space="preserve">United States</w:t>
+            </w:r>
+          </w:p>
+        </w:tc>
+        <w:tc>
+          <w:tcPr/>
+          <w:p>
+            <w:pPr>
+              <w:pStyle w:val="Compact"/>
+              <w:jc w:val="right"/>
+            </w:pPr>
+            <w:r>
+              <w:t xml:space="preserve">1672</w:t>
+            </w:r>
+          </w:p>
+        </w:tc>
+        <w:tc>
+          <w:tcPr/>
+          <w:p>
+            <w:pPr>
+              <w:pStyle w:val="Compact"/>
+              <w:jc w:val="right"/>
+            </w:pPr>
+            <w:r>
+              <w:t xml:space="preserve">0.64</w:t>
+            </w:r>
+          </w:p>
+        </w:tc>
+      </w:tr>
+      <w:tr>
+        <w:tc>
+          <w:tcPr/>
+          <w:p>
+            <w:pPr>
+              <w:pStyle w:val="Compact"/>
+              <w:jc w:val="left"/>
+            </w:pPr>
+            <w:r>
+              <w:t xml:space="preserve">Turkey</w:t>
+            </w:r>
+          </w:p>
+        </w:tc>
+        <w:tc>
+          <w:tcPr/>
+          <w:p>
+            <w:pPr>
+              <w:pStyle w:val="Compact"/>
+              <w:jc w:val="right"/>
+            </w:pPr>
+            <w:r>
+              <w:t xml:space="preserve">1468</w:t>
+            </w:r>
+          </w:p>
+        </w:tc>
+        <w:tc>
+          <w:tcPr/>
+          <w:p>
+            <w:pPr>
+              <w:pStyle w:val="Compact"/>
+              <w:jc w:val="right"/>
+            </w:pPr>
+            <w:r>
+              <w:t xml:space="preserve">0.65</w:t>
+            </w:r>
+          </w:p>
+        </w:tc>
+      </w:tr>
+      <w:tr>
+        <w:tc>
+          <w:tcPr/>
+          <w:p>
+            <w:pPr>
+              <w:pStyle w:val="Compact"/>
+              <w:jc w:val="left"/>
+            </w:pPr>
+            <w:r>
+              <w:t xml:space="preserve">Spain</w:t>
+            </w:r>
+          </w:p>
+        </w:tc>
+        <w:tc>
+          <w:tcPr/>
+          <w:p>
+            <w:pPr>
+              <w:pStyle w:val="Compact"/>
+              <w:jc w:val="right"/>
+            </w:pPr>
+            <w:r>
+              <w:t xml:space="preserve">1446</w:t>
+            </w:r>
+          </w:p>
+        </w:tc>
+        <w:tc>
+          <w:tcPr/>
+          <w:p>
+            <w:pPr>
+              <w:pStyle w:val="Compact"/>
+              <w:jc w:val="right"/>
+            </w:pPr>
+            <w:r>
+              <w:t xml:space="preserve">0.64</w:t>
+            </w:r>
+          </w:p>
+        </w:tc>
+      </w:tr>
+      <w:tr>
+        <w:tc>
+          <w:tcPr/>
+          <w:p>
+            <w:pPr>
+              <w:pStyle w:val="Compact"/>
+              <w:jc w:val="left"/>
+            </w:pPr>
+            <w:r>
+              <w:t xml:space="preserve">Italy</w:t>
+            </w:r>
+          </w:p>
+        </w:tc>
+        <w:tc>
+          <w:tcPr/>
+          <w:p>
+            <w:pPr>
+              <w:pStyle w:val="Compact"/>
+              <w:jc w:val="right"/>
+            </w:pPr>
+            <w:r>
+              <w:t xml:space="preserve">896</w:t>
+            </w:r>
+          </w:p>
+        </w:tc>
+        <w:tc>
+          <w:tcPr/>
+          <w:p>
+            <w:pPr>
+              <w:pStyle w:val="Compact"/>
+              <w:jc w:val="right"/>
+            </w:pPr>
+            <w:r>
+              <w:t xml:space="preserve">0.57</w:t>
+            </w:r>
+          </w:p>
+        </w:tc>
+      </w:tr>
+      <w:tr>
+        <w:tc>
+          <w:tcPr/>
+          <w:p>
+            <w:pPr>
+              <w:pStyle w:val="Compact"/>
+              <w:jc w:val="left"/>
+            </w:pPr>
+            <w:r>
+              <w:t xml:space="preserve">United Kingdom</w:t>
+            </w:r>
+          </w:p>
+        </w:tc>
+        <w:tc>
+          <w:tcPr/>
+          <w:p>
+            <w:pPr>
+              <w:pStyle w:val="Compact"/>
+              <w:jc w:val="right"/>
+            </w:pPr>
+            <w:r>
+              <w:t xml:space="preserve">842</w:t>
+            </w:r>
+          </w:p>
+        </w:tc>
+        <w:tc>
+          <w:tcPr/>
+          <w:p>
+            <w:pPr>
+              <w:pStyle w:val="Compact"/>
+              <w:jc w:val="right"/>
+            </w:pPr>
+            <w:r>
+              <w:t xml:space="preserve">0.67</w:t>
+            </w:r>
+          </w:p>
+        </w:tc>
+      </w:tr>
+      <w:tr>
+        <w:tc>
+          <w:tcPr/>
+          <w:p>
+            <w:pPr>
+              <w:pStyle w:val="Compact"/>
+              <w:jc w:val="left"/>
+            </w:pPr>
+            <w:r>
+              <w:t xml:space="preserve">Poland</w:t>
+            </w:r>
+          </w:p>
+        </w:tc>
+        <w:tc>
+          <w:tcPr/>
+          <w:p>
+            <w:pPr>
+              <w:pStyle w:val="Compact"/>
+              <w:jc w:val="right"/>
+            </w:pPr>
+            <w:r>
+              <w:t xml:space="preserve">452</w:t>
+            </w:r>
+          </w:p>
+        </w:tc>
+        <w:tc>
+          <w:tcPr/>
+          <w:p>
+            <w:pPr>
+              <w:pStyle w:val="Compact"/>
+              <w:jc w:val="right"/>
+            </w:pPr>
+            <w:r>
+              <w:t xml:space="preserve">0.62</w:t>
+            </w:r>
+          </w:p>
+        </w:tc>
+      </w:tr>
+      <w:tr>
+        <w:tc>
+          <w:tcPr/>
+          <w:p>
+            <w:pPr>
+              <w:pStyle w:val="Compact"/>
+              <w:jc w:val="left"/>
+            </w:pPr>
+            <w:r>
+              <w:t xml:space="preserve">Philippines</w:t>
+            </w:r>
+          </w:p>
+        </w:tc>
+        <w:tc>
+          <w:tcPr/>
+          <w:p>
+            <w:pPr>
+              <w:pStyle w:val="Compact"/>
+              <w:jc w:val="right"/>
+            </w:pPr>
+            <w:r>
+              <w:t xml:space="preserve">414</w:t>
+            </w:r>
+          </w:p>
+        </w:tc>
+        <w:tc>
+          <w:tcPr/>
+          <w:p>
+            <w:pPr>
+              <w:pStyle w:val="Compact"/>
+              <w:jc w:val="right"/>
+            </w:pPr>
+            <w:r>
+              <w:t xml:space="preserve">0.68</w:t>
+            </w:r>
+          </w:p>
+        </w:tc>
+      </w:tr>
+      <w:tr>
+        <w:tc>
+          <w:tcPr/>
+          <w:p>
+            <w:pPr>
+              <w:pStyle w:val="Compact"/>
+              <w:jc w:val="left"/>
+            </w:pPr>
+            <w:r>
+              <w:t xml:space="preserve">Australia</w:t>
+            </w:r>
+          </w:p>
+        </w:tc>
+        <w:tc>
+          <w:tcPr/>
+          <w:p>
+            <w:pPr>
+              <w:pStyle w:val="Compact"/>
+              <w:jc w:val="right"/>
+            </w:pPr>
+            <w:r>
+              <w:t xml:space="preserve">410</w:t>
+            </w:r>
+          </w:p>
+        </w:tc>
+        <w:tc>
+          <w:tcPr/>
+          <w:p>
+            <w:pPr>
+              <w:pStyle w:val="Compact"/>
+              <w:jc w:val="right"/>
+            </w:pPr>
+            <w:r>
+              <w:t xml:space="preserve">0.66</w:t>
+            </w:r>
+          </w:p>
+        </w:tc>
+      </w:tr>
+      <w:tr>
+        <w:tc>
+          <w:tcPr/>
+          <w:p>
+            <w:pPr>
+              <w:pStyle w:val="Compact"/>
+              <w:jc w:val="left"/>
+            </w:pPr>
+            <w:r>
+              <w:t xml:space="preserve">Germany</w:t>
+            </w:r>
+          </w:p>
+        </w:tc>
+        <w:tc>
+          <w:tcPr/>
+          <w:p>
+            <w:pPr>
+              <w:pStyle w:val="Compact"/>
+              <w:jc w:val="right"/>
+            </w:pPr>
+            <w:r>
+              <w:t xml:space="preserve">373</w:t>
+            </w:r>
+          </w:p>
+        </w:tc>
+        <w:tc>
+          <w:tcPr/>
+          <w:p>
+            <w:pPr>
+              <w:pStyle w:val="Compact"/>
+              <w:jc w:val="right"/>
+            </w:pPr>
+            <w:r>
+              <w:t xml:space="preserve">0.65</w:t>
+            </w:r>
+          </w:p>
+        </w:tc>
+      </w:tr>
+      <w:tr>
+        <w:tc>
+          <w:tcPr/>
+          <w:p>
+            <w:pPr>
+              <w:pStyle w:val="Compact"/>
+              <w:jc w:val="left"/>
+            </w:pPr>
+            <w:r>
+              <w:t xml:space="preserve">Colombia</w:t>
+            </w:r>
+          </w:p>
+        </w:tc>
+        <w:tc>
+          <w:tcPr/>
+          <w:p>
+            <w:pPr>
+              <w:pStyle w:val="Compact"/>
+              <w:jc w:val="right"/>
+            </w:pPr>
+            <w:r>
+              <w:t xml:space="preserve">372</w:t>
+            </w:r>
+          </w:p>
+        </w:tc>
+        <w:tc>
+          <w:tcPr/>
+          <w:p>
+            <w:pPr>
+              <w:pStyle w:val="Compact"/>
+              <w:jc w:val="right"/>
+            </w:pPr>
+            <w:r>
+              <w:t xml:space="preserve">0.67</w:t>
+            </w:r>
+          </w:p>
+        </w:tc>
+      </w:tr>
+      <w:tr>
+        <w:tc>
+          <w:tcPr/>
+          <w:p>
+            <w:pPr>
+              <w:pStyle w:val="Compact"/>
+              <w:jc w:val="left"/>
+            </w:pPr>
+            <w:r>
+              <w:t xml:space="preserve">Malaysia</w:t>
+            </w:r>
+          </w:p>
+        </w:tc>
+        <w:tc>
+          <w:tcPr/>
+          <w:p>
+            <w:pPr>
+              <w:pStyle w:val="Compact"/>
+              <w:jc w:val="right"/>
+            </w:pPr>
+            <w:r>
+              <w:t xml:space="preserve">349</w:t>
+            </w:r>
+          </w:p>
+        </w:tc>
+        <w:tc>
+          <w:tcPr/>
+          <w:p>
+            <w:pPr>
+              <w:pStyle w:val="Compact"/>
+              <w:jc w:val="right"/>
+            </w:pPr>
+            <w:r>
+              <w:t xml:space="preserve">0.62</w:t>
+            </w:r>
+          </w:p>
+        </w:tc>
+      </w:tr>
+      <w:tr>
+        <w:tc>
+          <w:tcPr/>
+          <w:p>
+            <w:pPr>
+              <w:pStyle w:val="Compact"/>
+              <w:jc w:val="left"/>
+            </w:pPr>
+            <w:r>
+              <w:t xml:space="preserve">Bulgaria</w:t>
+            </w:r>
+          </w:p>
+        </w:tc>
+        <w:tc>
+          <w:tcPr/>
+          <w:p>
+            <w:pPr>
+              <w:pStyle w:val="Compact"/>
+              <w:jc w:val="right"/>
+            </w:pPr>
+            <w:r>
+              <w:t xml:space="preserve">348</w:t>
+            </w:r>
+          </w:p>
+        </w:tc>
+        <w:tc>
+          <w:tcPr/>
+          <w:p>
+            <w:pPr>
+              <w:pStyle w:val="Compact"/>
+              <w:jc w:val="right"/>
+            </w:pPr>
+            <w:r>
+              <w:t xml:space="preserve">0.64</w:t>
+            </w:r>
+          </w:p>
+        </w:tc>
+      </w:tr>
+      <w:tr>
+        <w:tc>
+          <w:tcPr/>
+          <w:p>
+            <w:pPr>
+              <w:pStyle w:val="Compact"/>
+              <w:jc w:val="left"/>
+            </w:pPr>
+            <w:r>
+              <w:t xml:space="preserve">Austria</w:t>
+            </w:r>
+          </w:p>
+        </w:tc>
+        <w:tc>
+          <w:tcPr/>
+          <w:p>
+            <w:pPr>
+              <w:pStyle w:val="Compact"/>
+              <w:jc w:val="right"/>
+            </w:pPr>
+            <w:r>
+              <w:t xml:space="preserve">287</w:t>
+            </w:r>
+          </w:p>
+        </w:tc>
+        <w:tc>
+          <w:tcPr/>
+          <w:p>
+            <w:pPr>
+              <w:pStyle w:val="Compact"/>
+              <w:jc w:val="right"/>
+            </w:pPr>
+            <w:r>
+              <w:t xml:space="preserve">0.62</w:t>
+            </w:r>
+          </w:p>
+        </w:tc>
+      </w:tr>
+      <w:tr>
+        <w:tc>
+          <w:tcPr/>
+          <w:p>
+            <w:pPr>
+              <w:pStyle w:val="Compact"/>
+              <w:jc w:val="left"/>
+            </w:pPr>
+            <w:r>
+              <w:t xml:space="preserve">Canada</w:t>
+            </w:r>
+          </w:p>
+        </w:tc>
+        <w:tc>
+          <w:tcPr/>
+          <w:p>
+            <w:pPr>
+              <w:pStyle w:val="Compact"/>
+              <w:jc w:val="right"/>
+            </w:pPr>
+            <w:r>
+              <w:t xml:space="preserve">278</w:t>
+            </w:r>
+          </w:p>
+        </w:tc>
+        <w:tc>
+          <w:tcPr/>
+          <w:p>
+            <w:pPr>
+              <w:pStyle w:val="Compact"/>
+              <w:jc w:val="right"/>
+            </w:pPr>
+            <w:r>
+              <w:t xml:space="preserve">0.64</w:t>
+            </w:r>
+          </w:p>
+        </w:tc>
+      </w:tr>
+      <w:tr>
+        <w:tc>
+          <w:tcPr/>
+          <w:p>
+            <w:pPr>
+              <w:pStyle w:val="Compact"/>
+              <w:jc w:val="left"/>
+            </w:pPr>
+            <w:r>
+              <w:t xml:space="preserve">Netherlands</w:t>
+            </w:r>
+          </w:p>
+        </w:tc>
+        <w:tc>
+          <w:tcPr/>
+          <w:p>
+            <w:pPr>
+              <w:pStyle w:val="Compact"/>
+              <w:jc w:val="right"/>
+            </w:pPr>
+            <w:r>
+              <w:t xml:space="preserve">276</w:t>
+            </w:r>
+          </w:p>
+        </w:tc>
+        <w:tc>
+          <w:tcPr/>
+          <w:p>
+            <w:pPr>
+              <w:pStyle w:val="Compact"/>
+              <w:jc w:val="right"/>
+            </w:pPr>
+            <w:r>
+              <w:t xml:space="preserve">0.67</w:t>
+            </w:r>
+          </w:p>
+        </w:tc>
+      </w:tr>
+      <w:tr>
+        <w:tc>
+          <w:tcPr/>
+          <w:p>
+            <w:pPr>
+              <w:pStyle w:val="Compact"/>
+              <w:jc w:val="left"/>
+            </w:pPr>
+            <w:r>
+              <w:t xml:space="preserve">Greece</w:t>
+            </w:r>
+          </w:p>
+        </w:tc>
+        <w:tc>
+          <w:tcPr/>
+          <w:p>
+            <w:pPr>
+              <w:pStyle w:val="Compact"/>
+              <w:jc w:val="right"/>
+            </w:pPr>
+            <w:r>
+              <w:t xml:space="preserve">273</w:t>
+            </w:r>
+          </w:p>
+        </w:tc>
+        <w:tc>
+          <w:tcPr/>
+          <w:p>
+            <w:pPr>
+              <w:pStyle w:val="Compact"/>
+              <w:jc w:val="right"/>
+            </w:pPr>
+            <w:r>
+              <w:t xml:space="preserve">0.71</w:t>
+            </w:r>
+          </w:p>
+        </w:tc>
+      </w:tr>
+      <w:tr>
+        <w:tc>
+          <w:tcPr/>
+          <w:p>
+            <w:pPr>
+              <w:pStyle w:val="Compact"/>
+              <w:jc w:val="left"/>
+            </w:pPr>
+            <w:r>
+              <w:t xml:space="preserve">India</w:t>
+            </w:r>
+          </w:p>
+        </w:tc>
+        <w:tc>
+          <w:tcPr/>
+          <w:p>
+            <w:pPr>
+              <w:pStyle w:val="Compact"/>
+              <w:jc w:val="right"/>
+            </w:pPr>
+            <w:r>
+              <w:t xml:space="preserve">268</w:t>
+            </w:r>
+          </w:p>
+        </w:tc>
+        <w:tc>
+          <w:tcPr/>
+          <w:p>
+            <w:pPr>
+              <w:pStyle w:val="Compact"/>
+              <w:jc w:val="right"/>
+            </w:pPr>
+            <w:r>
+              <w:t xml:space="preserve">0.71</w:t>
+            </w:r>
+          </w:p>
+        </w:tc>
+      </w:tr>
+      <w:tr>
+        <w:tc>
+          <w:tcPr/>
+          <w:p>
+            <w:pPr>
+              <w:pStyle w:val="Compact"/>
+              <w:jc w:val="left"/>
+            </w:pPr>
+            <w:r>
+              <w:t xml:space="preserve">Pakistan</w:t>
+            </w:r>
+          </w:p>
+        </w:tc>
+        <w:tc>
+          <w:tcPr/>
+          <w:p>
+            <w:pPr>
+              <w:pStyle w:val="Compact"/>
+              <w:jc w:val="right"/>
+            </w:pPr>
+            <w:r>
+              <w:t xml:space="preserve">257</w:t>
+            </w:r>
+          </w:p>
+        </w:tc>
+        <w:tc>
+          <w:tcPr/>
+          <w:p>
+            <w:pPr>
+              <w:pStyle w:val="Compact"/>
+              <w:jc w:val="right"/>
+            </w:pPr>
+            <w:r>
+              <w:t xml:space="preserve">0.64</w:t>
+            </w:r>
+          </w:p>
+        </w:tc>
+      </w:tr>
+      <w:tr>
+        <w:tc>
+          <w:tcPr/>
+          <w:p>
+            <w:pPr>
+              <w:pStyle w:val="Compact"/>
+              <w:jc w:val="left"/>
+            </w:pPr>
+            <w:r>
+              <w:t xml:space="preserve">Slovakia</w:t>
+            </w:r>
+          </w:p>
+        </w:tc>
+        <w:tc>
+          <w:tcPr/>
+          <w:p>
+            <w:pPr>
+              <w:pStyle w:val="Compact"/>
+              <w:jc w:val="right"/>
+            </w:pPr>
+            <w:r>
+              <w:t xml:space="preserve">236</w:t>
+            </w:r>
+          </w:p>
+        </w:tc>
+        <w:tc>
+          <w:tcPr/>
+          <w:p>
+            <w:pPr>
+              <w:pStyle w:val="Compact"/>
+              <w:jc w:val="right"/>
+            </w:pPr>
+            <w:r>
+              <w:t xml:space="preserve">0.69</w:t>
+            </w:r>
+          </w:p>
+        </w:tc>
+      </w:tr>
+      <w:tr>
+        <w:tc>
+          <w:tcPr/>
+          <w:p>
+            <w:pPr>
+              <w:pStyle w:val="Compact"/>
+              <w:jc w:val="left"/>
+            </w:pPr>
+            <w:r>
+              <w:t xml:space="preserve">Hungary</w:t>
+            </w:r>
+          </w:p>
+        </w:tc>
+        <w:tc>
+          <w:tcPr/>
+          <w:p>
+            <w:pPr>
+              <w:pStyle w:val="Compact"/>
+              <w:jc w:val="right"/>
+            </w:pPr>
+            <w:r>
+              <w:t xml:space="preserve">226</w:t>
+            </w:r>
+          </w:p>
+        </w:tc>
+        <w:tc>
+          <w:tcPr/>
+          <w:p>
+            <w:pPr>
+              <w:pStyle w:val="Compact"/>
+              <w:jc w:val="right"/>
+            </w:pPr>
+            <w:r>
+              <w:t xml:space="preserve">0.64</w:t>
+            </w:r>
+          </w:p>
+        </w:tc>
+      </w:tr>
+      <w:tr>
+        <w:tc>
+          <w:tcPr/>
+          <w:p>
+            <w:pPr>
+              <w:pStyle w:val="Compact"/>
+              <w:jc w:val="left"/>
+            </w:pPr>
+            <w:r>
+              <w:t xml:space="preserve">Serbia</w:t>
+            </w:r>
+          </w:p>
+        </w:tc>
+        <w:tc>
+          <w:tcPr/>
+          <w:p>
+            <w:pPr>
+              <w:pStyle w:val="Compact"/>
+              <w:jc w:val="right"/>
+            </w:pPr>
+            <w:r>
+              <w:t xml:space="preserve">220</w:t>
+            </w:r>
+          </w:p>
+        </w:tc>
+        <w:tc>
+          <w:tcPr/>
+          <w:p>
+            <w:pPr>
+              <w:pStyle w:val="Compact"/>
+              <w:jc w:val="right"/>
+            </w:pPr>
+            <w:r>
+              <w:t xml:space="preserve">0.66</w:t>
+            </w:r>
+          </w:p>
+        </w:tc>
+      </w:tr>
+      <w:tr>
+        <w:tc>
+          <w:tcPr/>
+          <w:p>
+            <w:pPr>
+              <w:pStyle w:val="Compact"/>
+              <w:jc w:val="left"/>
+            </w:pPr>
+            <w:r>
+              <w:t xml:space="preserve">Portugal</w:t>
+            </w:r>
+          </w:p>
+        </w:tc>
+        <w:tc>
+          <w:tcPr/>
+          <w:p>
+            <w:pPr>
+              <w:pStyle w:val="Compact"/>
+              <w:jc w:val="right"/>
+            </w:pPr>
+            <w:r>
+              <w:t xml:space="preserve">219</w:t>
+            </w:r>
+          </w:p>
+        </w:tc>
+        <w:tc>
+          <w:tcPr/>
+          <w:p>
+            <w:pPr>
+              <w:pStyle w:val="Compact"/>
+              <w:jc w:val="right"/>
+            </w:pPr>
+            <w:r>
+              <w:t xml:space="preserve">0.67</w:t>
+            </w:r>
+          </w:p>
+        </w:tc>
+      </w:tr>
+      <w:tr>
+        <w:tc>
+          <w:tcPr/>
+          <w:p>
+            <w:pPr>
+              <w:pStyle w:val="Compact"/>
+              <w:jc w:val="left"/>
+            </w:pPr>
+            <w:r>
+              <w:t xml:space="preserve">Russia</w:t>
+            </w:r>
+          </w:p>
+        </w:tc>
+        <w:tc>
+          <w:tcPr/>
+          <w:p>
+            <w:pPr>
+              <w:pStyle w:val="Compact"/>
+              <w:jc w:val="right"/>
+            </w:pPr>
+            <w:r>
+              <w:t xml:space="preserve">201</w:t>
+            </w:r>
+          </w:p>
+        </w:tc>
+        <w:tc>
+          <w:tcPr/>
+          <w:p>
+            <w:pPr>
+              <w:pStyle w:val="Compact"/>
+              <w:jc w:val="right"/>
+            </w:pPr>
+            <w:r>
+              <w:t xml:space="preserve">0.69</w:t>
+            </w:r>
+          </w:p>
+        </w:tc>
+      </w:tr>
+      <w:tr>
+        <w:tc>
+          <w:tcPr/>
+          <w:p>
+            <w:pPr>
+              <w:pStyle w:val="Compact"/>
+              <w:jc w:val="left"/>
+            </w:pPr>
+            <w:r>
+              <w:t xml:space="preserve">Chile</w:t>
+            </w:r>
+          </w:p>
+        </w:tc>
+        <w:tc>
+          <w:tcPr/>
+          <w:p>
+            <w:pPr>
+              <w:pStyle w:val="Compact"/>
+              <w:jc w:val="right"/>
+            </w:pPr>
+            <w:r>
+              <w:t xml:space="preserve">197</w:t>
+            </w:r>
+          </w:p>
+        </w:tc>
+        <w:tc>
+          <w:tcPr/>
+          <w:p>
+            <w:pPr>
+              <w:pStyle w:val="Compact"/>
+              <w:jc w:val="right"/>
+            </w:pPr>
+            <w:r>
+              <w:t xml:space="preserve">0.78</w:t>
+            </w:r>
+          </w:p>
+        </w:tc>
+      </w:tr>
+      <w:tr>
+        <w:tc>
+          <w:tcPr/>
+          <w:p>
+            <w:pPr>
+              <w:pStyle w:val="Compact"/>
+              <w:jc w:val="left"/>
+            </w:pPr>
+            <w:r>
+              <w:t xml:space="preserve">North Macedonia</w:t>
+            </w:r>
+          </w:p>
+        </w:tc>
+        <w:tc>
+          <w:tcPr/>
+          <w:p>
+            <w:pPr>
+              <w:pStyle w:val="Compact"/>
+              <w:jc w:val="right"/>
+            </w:pPr>
+            <w:r>
+              <w:t xml:space="preserve">186</w:t>
+            </w:r>
+          </w:p>
+        </w:tc>
+        <w:tc>
+          <w:tcPr/>
+          <w:p>
+            <w:pPr>
+              <w:pStyle w:val="Compact"/>
+              <w:jc w:val="right"/>
+            </w:pPr>
+            <w:r>
+              <w:t xml:space="preserve">0.62</w:t>
+            </w:r>
+          </w:p>
+        </w:tc>
+      </w:tr>
+      <w:tr>
+        <w:tc>
+          <w:tcPr/>
+          <w:p>
+            <w:pPr>
+              <w:pStyle w:val="Compact"/>
+              <w:jc w:val="left"/>
+            </w:pPr>
+            <w:r>
+              <w:t xml:space="preserve">Egypt</w:t>
+            </w:r>
+          </w:p>
+        </w:tc>
+        <w:tc>
+          <w:tcPr/>
+          <w:p>
+            <w:pPr>
+              <w:pStyle w:val="Compact"/>
+              <w:jc w:val="right"/>
+            </w:pPr>
+            <w:r>
+              <w:t xml:space="preserve">183</w:t>
+            </w:r>
+          </w:p>
+        </w:tc>
+        <w:tc>
+          <w:tcPr/>
+          <w:p>
+            <w:pPr>
+              <w:pStyle w:val="Compact"/>
+              <w:jc w:val="right"/>
+            </w:pPr>
+            <w:r>
+              <w:t xml:space="preserve">0.52</w:t>
+            </w:r>
+          </w:p>
+        </w:tc>
+      </w:tr>
+      <w:tr>
+        <w:tc>
+          <w:tcPr/>
+          <w:p>
+            <w:pPr>
+              <w:pStyle w:val="Compact"/>
+              <w:jc w:val="left"/>
+            </w:pPr>
+            <w:r>
+              <w:t xml:space="preserve">Singapore</w:t>
+            </w:r>
+          </w:p>
+        </w:tc>
+        <w:tc>
+          <w:tcPr/>
+          <w:p>
+            <w:pPr>
+              <w:pStyle w:val="Compact"/>
+              <w:jc w:val="right"/>
+            </w:pPr>
+            <w:r>
+              <w:t xml:space="preserve">176</w:t>
+            </w:r>
+          </w:p>
+        </w:tc>
+        <w:tc>
+          <w:tcPr/>
+          <w:p>
+            <w:pPr>
+              <w:pStyle w:val="Compact"/>
+              <w:jc w:val="right"/>
+            </w:pPr>
+            <w:r>
+              <w:t xml:space="preserve">0.73</w:t>
+            </w:r>
+          </w:p>
+        </w:tc>
+      </w:tr>
+      <w:tr>
+        <w:tc>
+          <w:tcPr/>
+          <w:p>
+            <w:pPr>
+              <w:pStyle w:val="Compact"/>
+              <w:jc w:val="left"/>
+            </w:pPr>
+            <w:r>
+              <w:t xml:space="preserve">Kuwait</w:t>
+            </w:r>
+          </w:p>
+        </w:tc>
+        <w:tc>
+          <w:tcPr/>
+          <w:p>
+            <w:pPr>
+              <w:pStyle w:val="Compact"/>
+              <w:jc w:val="right"/>
+            </w:pPr>
+            <w:r>
+              <w:t xml:space="preserve">168</w:t>
+            </w:r>
+          </w:p>
+        </w:tc>
+        <w:tc>
+          <w:tcPr/>
+          <w:p>
+            <w:pPr>
+              <w:pStyle w:val="Compact"/>
+              <w:jc w:val="right"/>
+            </w:pPr>
+            <w:r>
+              <w:t xml:space="preserve">0.71</w:t>
+            </w:r>
+          </w:p>
+        </w:tc>
+      </w:tr>
+      <w:tr>
+        <w:tc>
+          <w:tcPr/>
+          <w:p>
+            <w:pPr>
+              <w:pStyle w:val="Compact"/>
+              <w:jc w:val="left"/>
+            </w:pPr>
+            <w:r>
+              <w:t xml:space="preserve">France</w:t>
+            </w:r>
+          </w:p>
+        </w:tc>
+        <w:tc>
+          <w:tcPr/>
+          <w:p>
+            <w:pPr>
+              <w:pStyle w:val="Compact"/>
+              <w:jc w:val="right"/>
+            </w:pPr>
+            <w:r>
+              <w:t xml:space="preserve">166</w:t>
+            </w:r>
+          </w:p>
+        </w:tc>
+        <w:tc>
+          <w:tcPr/>
+          <w:p>
+            <w:pPr>
+              <w:pStyle w:val="Compact"/>
+              <w:jc w:val="right"/>
+            </w:pPr>
+            <w:r>
+              <w:t xml:space="preserve">0.56</w:t>
+            </w:r>
+          </w:p>
+        </w:tc>
+      </w:tr>
+      <w:tr>
+        <w:tc>
+          <w:tcPr/>
+          <w:p>
+            <w:pPr>
+              <w:pStyle w:val="Compact"/>
+              <w:jc w:val="left"/>
+            </w:pPr>
+            <w:r>
+              <w:t xml:space="preserve">Czech Republic</w:t>
+            </w:r>
+          </w:p>
+        </w:tc>
+        <w:tc>
+          <w:tcPr/>
+          <w:p>
+            <w:pPr>
+              <w:pStyle w:val="Compact"/>
+              <w:jc w:val="right"/>
+            </w:pPr>
+            <w:r>
+              <w:t xml:space="preserve">158</w:t>
+            </w:r>
+          </w:p>
+        </w:tc>
+        <w:tc>
+          <w:tcPr/>
+          <w:p>
+            <w:pPr>
+              <w:pStyle w:val="Compact"/>
+              <w:jc w:val="right"/>
+            </w:pPr>
+            <w:r>
+              <w:t xml:space="preserve">0.67</w:t>
+            </w:r>
+          </w:p>
+        </w:tc>
+      </w:tr>
+      <w:tr>
+        <w:tc>
+          <w:tcPr/>
+          <w:p>
+            <w:pPr>
+              <w:pStyle w:val="Compact"/>
+              <w:jc w:val="left"/>
+            </w:pPr>
+            <w:r>
+              <w:t xml:space="preserve">Sierra Leone</w:t>
+            </w:r>
+          </w:p>
+        </w:tc>
+        <w:tc>
+          <w:tcPr/>
+          <w:p>
+            <w:pPr>
+              <w:pStyle w:val="Compact"/>
+              <w:jc w:val="right"/>
+            </w:pPr>
+            <w:r>
+              <w:t xml:space="preserve">146</w:t>
+            </w:r>
+          </w:p>
+        </w:tc>
+        <w:tc>
+          <w:tcPr/>
+          <w:p>
+            <w:pPr>
+              <w:pStyle w:val="Compact"/>
+              <w:jc w:val="right"/>
+            </w:pPr>
+            <w:r>
+              <w:t xml:space="preserve">0.71</w:t>
+            </w:r>
+          </w:p>
+        </w:tc>
+      </w:tr>
+      <w:tr>
+        <w:tc>
+          <w:tcPr/>
+          <w:p>
+            <w:pPr>
+              <w:pStyle w:val="Compact"/>
+              <w:jc w:val="left"/>
+            </w:pPr>
+            <w:r>
+              <w:t xml:space="preserve">Nigeria</w:t>
+            </w:r>
+          </w:p>
+        </w:tc>
+        <w:tc>
+          <w:tcPr/>
+          <w:p>
+            <w:pPr>
+              <w:pStyle w:val="Compact"/>
+              <w:jc w:val="right"/>
+            </w:pPr>
+            <w:r>
+              <w:t xml:space="preserve">144</w:t>
+            </w:r>
+          </w:p>
+        </w:tc>
+        <w:tc>
+          <w:tcPr/>
+          <w:p>
+            <w:pPr>
+              <w:pStyle w:val="Compact"/>
+              <w:jc w:val="right"/>
+            </w:pPr>
+            <w:r>
+              <w:t xml:space="preserve">0.67</w:t>
+            </w:r>
+          </w:p>
+        </w:tc>
+      </w:tr>
+      <w:tr>
+        <w:tc>
+          <w:tcPr/>
+          <w:p>
+            <w:pPr>
+              <w:pStyle w:val="Compact"/>
+              <w:jc w:val="left"/>
+            </w:pPr>
+            <w:r>
+              <w:t xml:space="preserve">Kenya</w:t>
+            </w:r>
+          </w:p>
+        </w:tc>
+        <w:tc>
+          <w:tcPr/>
+          <w:p>
+            <w:pPr>
+              <w:pStyle w:val="Compact"/>
+              <w:jc w:val="right"/>
+            </w:pPr>
+            <w:r>
+              <w:t xml:space="preserve">143</w:t>
+            </w:r>
+          </w:p>
+        </w:tc>
+        <w:tc>
+          <w:tcPr/>
+          <w:p>
+            <w:pPr>
+              <w:pStyle w:val="Compact"/>
+              <w:jc w:val="right"/>
+            </w:pPr>
+            <w:r>
+              <w:t xml:space="preserve">0.74</w:t>
+            </w:r>
+          </w:p>
+        </w:tc>
+      </w:tr>
+      <w:tr>
+        <w:tc>
+          <w:tcPr/>
+          <w:p>
+            <w:pPr>
+              <w:pStyle w:val="Compact"/>
+              <w:jc w:val="left"/>
+            </w:pPr>
+            <w:r>
+              <w:t xml:space="preserve">China</w:t>
+            </w:r>
+          </w:p>
+        </w:tc>
+        <w:tc>
+          <w:tcPr/>
+          <w:p>
+            <w:pPr>
+              <w:pStyle w:val="Compact"/>
+              <w:jc w:val="right"/>
+            </w:pPr>
+            <w:r>
+              <w:t xml:space="preserve">136</w:t>
+            </w:r>
+          </w:p>
+        </w:tc>
+        <w:tc>
+          <w:tcPr/>
+          <w:p>
+            <w:pPr>
+              <w:pStyle w:val="Compact"/>
+              <w:jc w:val="right"/>
+            </w:pPr>
+            <w:r>
+              <w:t xml:space="preserve">0.57</w:t>
+            </w:r>
+          </w:p>
+        </w:tc>
+      </w:tr>
+      <w:tr>
+        <w:tc>
+          <w:tcPr/>
+          <w:p>
+            <w:pPr>
+              <w:pStyle w:val="Compact"/>
+              <w:jc w:val="left"/>
+            </w:pPr>
+            <w:r>
+              <w:t xml:space="preserve">South Africa</w:t>
+            </w:r>
+          </w:p>
+        </w:tc>
+        <w:tc>
+          <w:tcPr/>
+          <w:p>
+            <w:pPr>
+              <w:pStyle w:val="Compact"/>
+              <w:jc w:val="right"/>
+            </w:pPr>
+            <w:r>
+              <w:t xml:space="preserve">133</w:t>
+            </w:r>
+          </w:p>
+        </w:tc>
+        <w:tc>
+          <w:tcPr/>
+          <w:p>
+            <w:pPr>
+              <w:pStyle w:val="Compact"/>
+              <w:jc w:val="right"/>
+            </w:pPr>
+            <w:r>
+              <w:t xml:space="preserve">0.72</w:t>
+            </w:r>
+          </w:p>
+        </w:tc>
+      </w:tr>
+      <w:tr>
+        <w:tc>
+          <w:tcPr/>
+          <w:p>
+            <w:pPr>
+              <w:pStyle w:val="Compact"/>
+              <w:jc w:val="left"/>
+            </w:pPr>
+            <w:r>
+              <w:t xml:space="preserve">Indonesia</w:t>
+            </w:r>
+          </w:p>
+        </w:tc>
+        <w:tc>
+          <w:tcPr/>
+          <w:p>
+            <w:pPr>
+              <w:pStyle w:val="Compact"/>
+              <w:jc w:val="right"/>
+            </w:pPr>
+            <w:r>
+              <w:t xml:space="preserve">123</w:t>
+            </w:r>
+          </w:p>
+        </w:tc>
+        <w:tc>
+          <w:tcPr/>
+          <w:p>
+            <w:pPr>
+              <w:pStyle w:val="Compact"/>
+              <w:jc w:val="right"/>
+            </w:pPr>
+            <w:r>
+              <w:t xml:space="preserve">0.64</w:t>
+            </w:r>
+          </w:p>
+        </w:tc>
+      </w:tr>
+      <w:tr>
+        <w:tc>
+          <w:tcPr/>
+          <w:p>
+            <w:pPr>
+              <w:pStyle w:val="Compact"/>
+              <w:jc w:val="left"/>
+            </w:pPr>
+            <w:r>
+              <w:t xml:space="preserve">Mexico</w:t>
+            </w:r>
+          </w:p>
+        </w:tc>
+        <w:tc>
+          <w:tcPr/>
+          <w:p>
+            <w:pPr>
+              <w:pStyle w:val="Compact"/>
+              <w:jc w:val="right"/>
+            </w:pPr>
+            <w:r>
+              <w:t xml:space="preserve">122</w:t>
+            </w:r>
+          </w:p>
+        </w:tc>
+        <w:tc>
+          <w:tcPr/>
+          <w:p>
+            <w:pPr>
+              <w:pStyle w:val="Compact"/>
+              <w:jc w:val="right"/>
+            </w:pPr>
+            <w:r>
+              <w:t xml:space="preserve">0.68</w:t>
+            </w:r>
+          </w:p>
+        </w:tc>
+      </w:tr>
+      <w:tr>
+        <w:tc>
+          <w:tcPr/>
+          <w:p>
+            <w:pPr>
+              <w:pStyle w:val="Compact"/>
+              <w:jc w:val="left"/>
+            </w:pPr>
+            <w:r>
+              <w:t xml:space="preserve">Ghana</w:t>
+            </w:r>
+          </w:p>
+        </w:tc>
+        <w:tc>
+          <w:tcPr/>
+          <w:p>
+            <w:pPr>
+              <w:pStyle w:val="Compact"/>
+              <w:jc w:val="right"/>
+            </w:pPr>
+            <w:r>
+              <w:t xml:space="preserve">110</w:t>
+            </w:r>
+          </w:p>
+        </w:tc>
+        <w:tc>
+          <w:tcPr/>
+          <w:p>
+            <w:pPr>
+              <w:pStyle w:val="Compact"/>
+              <w:jc w:val="right"/>
+            </w:pPr>
+            <w:r>
+              <w:t xml:space="preserve">0.83</w:t>
+            </w:r>
+          </w:p>
+        </w:tc>
+      </w:tr>
+      <w:tr>
+        <w:tc>
+          <w:tcPr/>
+          <w:p>
+            <w:pPr>
+              <w:pStyle w:val="Compact"/>
+              <w:jc w:val="left"/>
+            </w:pPr>
+            <w:r>
+              <w:t xml:space="preserve">Ethiopia</w:t>
+            </w:r>
+          </w:p>
+        </w:tc>
+        <w:tc>
+          <w:tcPr/>
+          <w:p>
+            <w:pPr>
+              <w:pStyle w:val="Compact"/>
+              <w:jc w:val="right"/>
+            </w:pPr>
+            <w:r>
+              <w:t xml:space="preserve">109</w:t>
+            </w:r>
+          </w:p>
+        </w:tc>
+        <w:tc>
+          <w:tcPr/>
+          <w:p>
+            <w:pPr>
+              <w:pStyle w:val="Compact"/>
+              <w:jc w:val="right"/>
+            </w:pPr>
+            <w:r>
+              <w:t xml:space="preserve">0.63</w:t>
+            </w:r>
+          </w:p>
+        </w:tc>
+      </w:tr>
+      <w:tr>
+        <w:tc>
+          <w:tcPr/>
+          <w:p>
+            <w:pPr>
+              <w:pStyle w:val="Compact"/>
+              <w:jc w:val="left"/>
+            </w:pPr>
+            <w:r>
+              <w:t xml:space="preserve">Cameroon</w:t>
+            </w:r>
+          </w:p>
+        </w:tc>
+        <w:tc>
+          <w:tcPr/>
+          <w:p>
+            <w:pPr>
+              <w:pStyle w:val="Compact"/>
+              <w:jc w:val="right"/>
+            </w:pPr>
+            <w:r>
+              <w:t xml:space="preserve">108</w:t>
+            </w:r>
+          </w:p>
+        </w:tc>
+        <w:tc>
+          <w:tcPr/>
+          <w:p>
+            <w:pPr>
+              <w:pStyle w:val="Compact"/>
+              <w:jc w:val="right"/>
+            </w:pPr>
+            <w:r>
+              <w:t xml:space="preserve">0.84</w:t>
+            </w:r>
+          </w:p>
+        </w:tc>
+      </w:tr>
+      <w:tr>
+        <w:tc>
+          <w:tcPr/>
+          <w:p>
+            <w:pPr>
+              <w:pStyle w:val="Compact"/>
+              <w:jc w:val="left"/>
+            </w:pPr>
+            <w:r>
+              <w:t xml:space="preserve">New Zealand</w:t>
+            </w:r>
+          </w:p>
+        </w:tc>
+        <w:tc>
+          <w:tcPr/>
+          <w:p>
+            <w:pPr>
+              <w:pStyle w:val="Compact"/>
+              <w:jc w:val="right"/>
+            </w:pPr>
+            <w:r>
+              <w:t xml:space="preserve">104</w:t>
+            </w:r>
+          </w:p>
+        </w:tc>
+        <w:tc>
+          <w:tcPr/>
+          <w:p>
+            <w:pPr>
+              <w:pStyle w:val="Compact"/>
+              <w:jc w:val="right"/>
+            </w:pPr>
+            <w:r>
+              <w:t xml:space="preserve">0.71</w:t>
+            </w:r>
+          </w:p>
+        </w:tc>
+      </w:tr>
+    </w:tbl>
+    <w:p>
+      <w:pPr>
+        <w:pStyle w:val="TableCaption"/>
+      </w:pPr>
+      <w:r>
+        <w:t xml:space="preserve">Measurement invariance analysis for the Intellectual Humility scale</w:t>
+      </w:r>
+    </w:p>
+    <w:tbl>
+      <w:tblPr>
+        <w:tblStyle w:val="Table"/>
+        <w:tblW w:type="auto" w:w="0"/>
+        <w:tblLook w:firstRow="1" w:lastRow="0" w:firstColumn="0" w:lastColumn="0" w:noHBand="0" w:noVBand="0" w:val="0020"/>
+        <w:tblCaption w:val="Measurement invariance analysis for the Intellectual Humility scale"/>
+      </w:tblPr>
+      <w:tblGrid>
+        <w:gridCol w:w="1131"/>
+        <w:gridCol w:w="1131"/>
+        <w:gridCol w:w="1131"/>
+        <w:gridCol w:w="1131"/>
+        <w:gridCol w:w="1131"/>
+        <w:gridCol w:w="1131"/>
+        <w:gridCol w:w="1131"/>
+      </w:tblGrid>
+      <w:tr>
+        <w:trPr>
+          <w:tblHeader w:val="on"/>
+        </w:trPr>
+        <w:tc>
+          <w:tcPr/>
+          <w:p>
+            <w:pPr>
+              <w:pStyle w:val="Compact"/>
+              <w:jc w:val="left"/>
+            </w:pPr>
+            <w:r>
+              <w:t xml:space="preserve">Model</w:t>
+            </w:r>
+          </w:p>
+        </w:tc>
+        <w:tc>
+          <w:tcPr/>
+          <w:p>
+            <w:pPr>
+              <w:pStyle w:val="Compact"/>
+              <w:jc w:val="center"/>
+            </w:pPr>
+            <w:r>
+              <w:t xml:space="preserve">CFI</w:t>
+            </w:r>
+          </w:p>
+        </w:tc>
+        <w:tc>
+          <w:tcPr/>
+          <w:p>
+            <w:pPr>
+              <w:pStyle w:val="Compact"/>
+              <w:jc w:val="center"/>
+            </w:pPr>
+            <w:r>
+              <w:t xml:space="preserve">TLI</w:t>
+            </w:r>
+          </w:p>
+        </w:tc>
+        <w:tc>
+          <w:tcPr/>
+          <w:p>
+            <w:pPr>
+              <w:pStyle w:val="Compact"/>
+              <w:jc w:val="center"/>
+            </w:pPr>
+            <w:r>
+              <w:t xml:space="preserve">RMSEA</w:t>
+            </w:r>
+          </w:p>
+        </w:tc>
+        <w:tc>
+          <w:tcPr/>
+          <w:p>
+            <w:pPr>
+              <w:pStyle w:val="Compact"/>
+              <w:jc w:val="center"/>
+            </w:pPr>
+            <w:r>
+              <w:t xml:space="preserve">SRMR</w:t>
+            </w:r>
+          </w:p>
+        </w:tc>
+        <w:tc>
+          <w:tcPr/>
+          <w:p>
+            <w:pPr>
+              <w:pStyle w:val="Compact"/>
+              <w:jc w:val="center"/>
+            </w:pPr>
+            <w:r>
+              <w:t xml:space="preserve">ΔCFI</w:t>
+            </w:r>
+          </w:p>
+        </w:tc>
+        <w:tc>
+          <w:tcPr/>
+          <w:p>
+            <w:pPr>
+              <w:pStyle w:val="Compact"/>
+              <w:jc w:val="center"/>
+            </w:pPr>
+            <w:r>
+              <w:t xml:space="preserve">ΔRMSEA</w:t>
+            </w:r>
+          </w:p>
+        </w:tc>
+      </w:tr>
+      <w:tr>
+        <w:tc>
+          <w:tcPr/>
+          <w:p>
+            <w:pPr>
+              <w:pStyle w:val="Compact"/>
+              <w:jc w:val="left"/>
+            </w:pPr>
+            <w:r>
+              <w:t xml:space="preserve">Configural</w:t>
+            </w:r>
+          </w:p>
+        </w:tc>
+        <w:tc>
+          <w:tcPr/>
+          <w:p>
+            <w:pPr>
+              <w:pStyle w:val="Compact"/>
+              <w:jc w:val="center"/>
+            </w:pPr>
+            <w:r>
+              <w:t xml:space="preserve">0.973</w:t>
+            </w:r>
+          </w:p>
+        </w:tc>
+        <w:tc>
+          <w:tcPr/>
+          <w:p>
+            <w:pPr>
+              <w:pStyle w:val="Compact"/>
+              <w:jc w:val="center"/>
+            </w:pPr>
+            <w:r>
+              <w:t xml:space="preserve">0.943</w:t>
+            </w:r>
+          </w:p>
+        </w:tc>
+        <w:tc>
+          <w:tcPr/>
+          <w:p>
+            <w:pPr>
+              <w:pStyle w:val="Compact"/>
+              <w:jc w:val="center"/>
+            </w:pPr>
+            <w:r>
+              <w:t xml:space="preserve">0.050</w:t>
+            </w:r>
+          </w:p>
+        </w:tc>
+        <w:tc>
+          <w:tcPr/>
+          <w:p>
+            <w:pPr>
+              <w:pStyle w:val="Compact"/>
+              <w:jc w:val="center"/>
+            </w:pPr>
+            <w:r>
+              <w:t xml:space="preserve">0.029</w:t>
+            </w:r>
+          </w:p>
+        </w:tc>
+        <w:tc>
+          <w:tcPr/>
+          <w:p>
+            <w:pPr>
+              <w:pStyle w:val="Compact"/>
+              <w:jc w:val="center"/>
+            </w:pPr>
+            <w:r>
+              <w:t xml:space="preserve">NA</w:t>
+            </w:r>
+          </w:p>
+        </w:tc>
+        <w:tc>
+          <w:tcPr/>
+          <w:p>
+            <w:pPr>
+              <w:pStyle w:val="Compact"/>
+              <w:jc w:val="center"/>
+            </w:pPr>
+            <w:r>
+              <w:t xml:space="preserve">NA</w:t>
+            </w:r>
+          </w:p>
+        </w:tc>
+      </w:tr>
+      <w:tr>
+        <w:tc>
+          <w:tcPr/>
+          <w:p>
+            <w:pPr>
+              <w:pStyle w:val="Compact"/>
+              <w:jc w:val="left"/>
+            </w:pPr>
+            <w:r>
+              <w:t xml:space="preserve">Metric</w:t>
+            </w:r>
+          </w:p>
+        </w:tc>
+        <w:tc>
+          <w:tcPr/>
+          <w:p>
+            <w:pPr>
+              <w:pStyle w:val="Compact"/>
+              <w:jc w:val="center"/>
+            </w:pPr>
+            <w:r>
+              <w:t xml:space="preserve">0.956</w:t>
+            </w:r>
+          </w:p>
+        </w:tc>
+        <w:tc>
+          <w:tcPr/>
+          <w:p>
+            <w:pPr>
+              <w:pStyle w:val="Compact"/>
+              <w:jc w:val="center"/>
+            </w:pPr>
+            <w:r>
+              <w:t xml:space="preserve">0.930</w:t>
+            </w:r>
+          </w:p>
+        </w:tc>
+        <w:tc>
+          <w:tcPr/>
+          <w:p>
+            <w:pPr>
+              <w:pStyle w:val="Compact"/>
+              <w:jc w:val="center"/>
+            </w:pPr>
+            <w:r>
+              <w:t xml:space="preserve">0.056</w:t>
+            </w:r>
+          </w:p>
+        </w:tc>
+        <w:tc>
+          <w:tcPr/>
+          <w:p>
+            <w:pPr>
+              <w:pStyle w:val="Compact"/>
+              <w:jc w:val="center"/>
+            </w:pPr>
+            <w:r>
+              <w:t xml:space="preserve">0.046</w:t>
+            </w:r>
+          </w:p>
+        </w:tc>
+        <w:tc>
+          <w:tcPr/>
+          <w:p>
+            <w:pPr>
+              <w:pStyle w:val="Compact"/>
+              <w:jc w:val="center"/>
+            </w:pPr>
+            <w:r>
+              <w:t xml:space="preserve">-0.017</w:t>
+            </w:r>
+          </w:p>
+        </w:tc>
+        <w:tc>
+          <w:tcPr/>
+          <w:p>
+            <w:pPr>
+              <w:pStyle w:val="Compact"/>
+              <w:jc w:val="center"/>
+            </w:pPr>
+            <w:r>
+              <w:t xml:space="preserve">0.005</w:t>
+            </w:r>
+          </w:p>
+        </w:tc>
+      </w:tr>
+      <w:tr>
+        <w:tc>
+          <w:tcPr/>
+          <w:p>
+            <w:pPr>
+              <w:pStyle w:val="Compact"/>
+              <w:jc w:val="left"/>
+            </w:pPr>
+            <w:r>
+              <w:t xml:space="preserve">Scalar</w:t>
+            </w:r>
+          </w:p>
+        </w:tc>
+        <w:tc>
+          <w:tcPr/>
+          <w:p>
+            <w:pPr>
+              <w:pStyle w:val="Compact"/>
+              <w:jc w:val="center"/>
+            </w:pPr>
+            <w:r>
+              <w:t xml:space="preserve">0.924</w:t>
+            </w:r>
+          </w:p>
+        </w:tc>
+        <w:tc>
+          <w:tcPr/>
+          <w:p>
+            <w:pPr>
+              <w:pStyle w:val="Compact"/>
+              <w:jc w:val="center"/>
+            </w:pPr>
+            <w:r>
+              <w:t xml:space="preserve">0.905</w:t>
+            </w:r>
+          </w:p>
+        </w:tc>
+        <w:tc>
+          <w:tcPr/>
+          <w:p>
+            <w:pPr>
+              <w:pStyle w:val="Compact"/>
+              <w:jc w:val="center"/>
+            </w:pPr>
+            <w:r>
+              <w:t xml:space="preserve">0.065</w:t>
+            </w:r>
+          </w:p>
+        </w:tc>
+        <w:tc>
+          <w:tcPr/>
+          <w:p>
+            <w:pPr>
+              <w:pStyle w:val="Compact"/>
+              <w:jc w:val="center"/>
+            </w:pPr>
+            <w:r>
+              <w:t xml:space="preserve">0.062</w:t>
+            </w:r>
+          </w:p>
+        </w:tc>
+        <w:tc>
+          <w:tcPr/>
+          <w:p>
+            <w:pPr>
+              <w:pStyle w:val="Compact"/>
+              <w:jc w:val="center"/>
+            </w:pPr>
+            <w:r>
+              <w:t xml:space="preserve">-0.032</w:t>
+            </w:r>
+          </w:p>
+        </w:tc>
+        <w:tc>
+          <w:tcPr/>
+          <w:p>
+            <w:pPr>
+              <w:pStyle w:val="Compact"/>
+              <w:jc w:val="center"/>
+            </w:pPr>
+            <w:r>
+              <w:t xml:space="preserve">0.009</w:t>
+            </w:r>
+          </w:p>
+        </w:tc>
+      </w:tr>
+    </w:tbl>
+    <w:p>
+      <w:pPr>
+        <w:pStyle w:val="BodyText"/>
+      </w:pPr>
+      <w:r>
+        <w:t xml:space="preserve">As an exploratory test of cross-country measurement invariance, we fitted multi-group CFAs in which the nine items loaded on a substantive intellectual-humility (IH) factor while separate positive- and negative-wording method factors captured the method effects identified in the original scale validation. The IH factor was specified as independent of the wording factors, while the two method factors were allowed to covary. The configural model showed good fit (CFI = .973, RMSEA = .050, SRMR = .029). We then constrained only the substantive IH loadings to equality across countries, leaving wording-factor loadings free; this produced a modest deterioration in fit (ΔCFI = −.017, ΔRMSEA = .005, ΔSRMR = .017). Adding equality constraints on item intercepts produced a larger deterioration (ΔCFI = −.032, ΔRMSEA = .009, ΔSRMR = .016). Thus, using the conventional ΔCFI ≤ .01 criterion, strict metric and scalar invariance were not supported, although departures from metric invariance were relatively modest. These results suggest that the scale captures a broadly similar construct across countries, but some caution is warranted.</w:t>
+      </w:r>
+    </w:p>
+    <w:bookmarkEnd w:id="38"/>
+    <w:bookmarkEnd w:id="39"/>
+    <w:bookmarkStart w:id="40" w:name="X715d53ed7a3146640af0b1534337bb41a21f168"/>
+    <w:p>
+      <w:pPr>
+        <w:pStyle w:val="Heading3"/>
+      </w:pPr>
+      <w:r>
+        <w:t xml:space="preserve">1.4.2 Individual Differences and Corrective Behaviour</w:t>
       </w:r>
     </w:p>
     <w:p>
@@ -23864,14 +25909,14 @@
         </w:tc>
       </w:tr>
     </w:tbl>
-    <w:bookmarkEnd w:id="38"/>
-    <w:bookmarkStart w:id="39" w:name="community-and-student-sample-differences"/>
+    <w:bookmarkEnd w:id="40"/>
+    <w:bookmarkStart w:id="41" w:name="community-and-student-sample-differences"/>
     <w:p>
       <w:pPr>
         <w:pStyle w:val="Heading3"/>
       </w:pPr>
       <w:r>
-        <w:t xml:space="preserve">1.4.2 Community and Student Sample Differences</w:t>
+        <w:t xml:space="preserve">1.4.3 Community and Student Sample Differences</w:t>
       </w:r>
     </w:p>
     <w:p>
@@ -26243,14 +28288,14 @@
         </w:tc>
       </w:tr>
     </w:tbl>
-    <w:bookmarkEnd w:id="39"/>
-    <w:bookmarkStart w:id="65" w:name="X55d5bb31491588f7d81cfb0349cc27cc194710e"/>
+    <w:bookmarkEnd w:id="41"/>
+    <w:bookmarkStart w:id="67" w:name="X55d5bb31491588f7d81cfb0349cc27cc194710e"/>
     <w:p>
       <w:pPr>
         <w:pStyle w:val="Heading3"/>
       </w:pPr>
       <w:r>
-        <w:t xml:space="preserve">1.4.3 Confidence Calibration and Intellectual Humility</w:t>
+        <w:t xml:space="preserve">1.4.4 Confidence Calibration and Intellectual Humility</w:t>
       </w:r>
     </w:p>
     <w:tbl>
@@ -26266,7 +28311,7 @@
       <w:tr>
         <w:tc>
           <w:tcPr/>
-          <w:bookmarkStart w:id="43" w:name="fig-calibration"/>
+          <w:bookmarkStart w:id="45" w:name="fig-calibration"/>
           <w:p>
             <w:pPr>
               <w:pStyle w:val="Compact"/>
@@ -26277,18 +28322,18 @@
                 <wp:inline>
                   <wp:extent cx="5334000" cy="2667000"/>
                   <wp:effectExtent b="0" l="0" r="0" t="0"/>
-                  <wp:docPr descr="" title="" id="41" name="Picture"/>
+                  <wp:docPr descr="" title="" id="43" name="Picture"/>
                   <a:graphic>
                     <a:graphicData uri="http://schemas.openxmlformats.org/drawingml/2006/picture">
                       <pic:pic>
                         <pic:nvPicPr>
-                          <pic:cNvPr descr="results_files/figure-docx/fig-calibration-1.png" id="42" name="Picture"/>
+                          <pic:cNvPr descr="results_files/figure-docx/fig-calibration-1.png" id="44" name="Picture"/>
                           <pic:cNvPicPr>
                             <a:picLocks noChangeArrowheads="1" noChangeAspect="1"/>
                           </pic:cNvPicPr>
                         </pic:nvPicPr>
                         <pic:blipFill>
-                          <a:blip r:embed="rId40"/>
+                          <a:blip r:embed="rId42"/>
                           <a:stretch>
                             <a:fillRect/>
                           </a:stretch>
@@ -26328,7 +28373,7 @@
               <w:t xml:space="preserve">Figure 2: Number of correct answer (vertical coordinates) plotted as a function of the answer to the calibration responses (e.g. the participant’s estimates of their own accuracy; horizontal coordinates). Some jitter added for visibility. Both plots demonstrates substantial over-confidence, since in both cases most points lie below the identity line. For this plot we only excluded problems where participants declared using external resources.</w:t>
             </w:r>
           </w:p>
-          <w:bookmarkEnd w:id="43"/>
+          <w:bookmarkEnd w:id="45"/>
         </w:tc>
       </w:tr>
     </w:tbl>
@@ -27302,7 +29347,7 @@
       <w:tr>
         <w:tc>
           <w:tcPr/>
-          <w:bookmarkStart w:id="47" w:name="fig-calibration-model"/>
+          <w:bookmarkStart w:id="49" w:name="fig-calibration-model"/>
           <w:p>
             <w:pPr>
               <w:pStyle w:val="Compact"/>
@@ -27313,18 +29358,18 @@
                 <wp:inline>
                   <wp:extent cx="5334000" cy="2667000"/>
                   <wp:effectExtent b="0" l="0" r="0" t="0"/>
-                  <wp:docPr descr="" title="" id="45" name="Picture"/>
+                  <wp:docPr descr="" title="" id="47" name="Picture"/>
                   <a:graphic>
                     <a:graphicData uri="http://schemas.openxmlformats.org/drawingml/2006/picture">
                       <pic:pic>
                         <pic:nvPicPr>
-                          <pic:cNvPr descr="results_files/figure-docx/fig-calibration-model-1.png" id="46" name="Picture"/>
+                          <pic:cNvPr descr="results_files/figure-docx/fig-calibration-model-1.png" id="48" name="Picture"/>
                           <pic:cNvPicPr>
                             <a:picLocks noChangeArrowheads="1" noChangeAspect="1"/>
                           </pic:cNvPicPr>
                         </pic:nvPicPr>
                         <pic:blipFill>
-                          <a:blip r:embed="rId44"/>
+                          <a:blip r:embed="rId46"/>
                           <a:stretch>
                             <a:fillRect/>
                           </a:stretch>
@@ -27364,7 +29409,7 @@
               <w:t xml:space="preserve">Figure 3: Intellectual humility and calibration of estimated performance. Generalised additive models (GAMs) predicting participants’ estimated number of correct answers from their actual accuracy and intellectual humility, fitted separately for the intuitive (left) and reflective (right) phases. Lines show model-predicted estimates for intellectual humility at the mean and ±1 SD; shaded bands indicate 95% confidence intervals. The dashed diagonal indicates perfect calibration, such that values above the line reflect overestimation and values below the line reflect underestimation. Intellectual humility was associated with a small overall shift in estimates in the intuitive phase, whereas in the reflective phase it showed a small but significant interaction with actual accuracy.</w:t>
             </w:r>
           </w:p>
-          <w:bookmarkEnd w:id="47"/>
+          <w:bookmarkEnd w:id="49"/>
         </w:tc>
       </w:tr>
     </w:tbl>
@@ -27381,7 +29426,7 @@
       <w:tr>
         <w:tc>
           <w:tcPr/>
-          <w:bookmarkStart w:id="51" w:name="fig-calibration-model-2"/>
+          <w:bookmarkStart w:id="53" w:name="fig-calibration-model-2"/>
           <w:p>
             <w:pPr>
               <w:pStyle w:val="Compact"/>
@@ -27392,18 +29437,18 @@
                 <wp:inline>
                   <wp:extent cx="5334000" cy="2667000"/>
                   <wp:effectExtent b="0" l="0" r="0" t="0"/>
-                  <wp:docPr descr="" title="" id="49" name="Picture"/>
+                  <wp:docPr descr="" title="" id="51" name="Picture"/>
                   <a:graphic>
                     <a:graphicData uri="http://schemas.openxmlformats.org/drawingml/2006/picture">
                       <pic:pic>
                         <pic:nvPicPr>
-                          <pic:cNvPr descr="results_files/figure-docx/fig-calibration-model-2-1.png" id="50" name="Picture"/>
+                          <pic:cNvPr descr="results_files/figure-docx/fig-calibration-model-2-1.png" id="52" name="Picture"/>
                           <pic:cNvPicPr>
                             <a:picLocks noChangeArrowheads="1" noChangeAspect="1"/>
                           </pic:cNvPicPr>
                         </pic:nvPicPr>
                         <pic:blipFill>
-                          <a:blip r:embed="rId48"/>
+                          <a:blip r:embed="rId50"/>
                           <a:stretch>
                             <a:fillRect/>
                           </a:stretch>
@@ -27443,7 +29488,7 @@
               <w:t xml:space="preserve">Figure 4: Intellectual humility, actual accuracy, and estimated performance. Generalised additive models (GAMs) predicting participants’ estimated number of correct answers from actual accuracy and intellectual humility, fitted separately for the intuitive (left) and reflective (right) phases. Lines show model-predicted estimates across the observed range of intellectual humility scores, plotted separately for each level of actual accuracy; shaded bands indicate 95% confidence intervals. In the intuitive phase, intellectual humility was associated with a small overall downward shift in estimated performance across accuracy levels. In the reflective phase, the association between intellectual humility and estimated performance varied modestly as a function of actual accuracy, consistent with a small but significant interaction.</w:t>
             </w:r>
           </w:p>
-          <w:bookmarkEnd w:id="51"/>
+          <w:bookmarkEnd w:id="53"/>
         </w:tc>
       </w:tr>
     </w:tbl>
@@ -27452,13 +29497,13 @@
         <w:br w:type="page"/>
       </w:r>
     </w:p>
-    <w:bookmarkStart w:id="52" w:name="robustness-analysis-quasibinomial-gams"/>
+    <w:bookmarkStart w:id="54" w:name="robustness-analysis-quasibinomial-gams"/>
     <w:p>
       <w:pPr>
         <w:pStyle w:val="Heading4"/>
       </w:pPr>
       <w:r>
-        <w:t xml:space="preserve">1.4.3.1 Robustness analysis: quasibinomial GAMs</w:t>
+        <w:t xml:space="preserve">1.4.4.1 Robustness analysis: quasibinomial GAMs</w:t>
       </w:r>
     </w:p>
     <w:p>
@@ -27469,14 +29514,14 @@
         <w:t xml:space="preserve">As a robustness analysis, we repeated the calibration analyses using quasibinomial GAMs. These models constrain predicted estimates to the possible 0–6 range while allowing for overdispersion relative to the binomial variance.</w:t>
       </w:r>
     </w:p>
-    <w:bookmarkEnd w:id="52"/>
-    <w:bookmarkStart w:id="54" w:name="model-estimates"/>
+    <w:bookmarkEnd w:id="54"/>
+    <w:bookmarkStart w:id="56" w:name="model-estimates"/>
     <w:p>
       <w:pPr>
         <w:pStyle w:val="Heading4"/>
       </w:pPr>
       <w:r>
-        <w:t xml:space="preserve">1.4.3.2 Model estimates</w:t>
+        <w:t xml:space="preserve">1.4.4.2 Model estimates</w:t>
       </w:r>
     </w:p>
     <w:tbl>
@@ -27492,7 +29537,7 @@
       <w:tr>
         <w:tc>
           <w:tcPr/>
-          <w:bookmarkStart w:id="53" w:name="tbl-gam-quasibinomial"/>
+          <w:bookmarkStart w:id="55" w:name="tbl-gam-quasibinomial"/>
           <w:p>
             <w:pPr>
               <w:jc w:val="center"/>
@@ -28519,19 +30564,19 @@
               </w:tc>
             </w:tr>
           </w:tbl>
-          <w:bookmarkEnd w:id="53"/>
+          <w:bookmarkEnd w:id="55"/>
           <w:p/>
         </w:tc>
       </w:tr>
     </w:tbl>
-    <w:bookmarkEnd w:id="54"/>
-    <w:bookmarkStart w:id="59" w:name="predicted-calibration-curves"/>
+    <w:bookmarkEnd w:id="56"/>
+    <w:bookmarkStart w:id="61" w:name="predicted-calibration-curves"/>
     <w:p>
       <w:pPr>
         <w:pStyle w:val="Heading4"/>
       </w:pPr>
       <w:r>
-        <w:t xml:space="preserve">1.4.3.3 Predicted calibration curves</w:t>
+        <w:t xml:space="preserve">1.4.4.3 Predicted calibration curves</w:t>
       </w:r>
     </w:p>
     <w:tbl>
@@ -28547,7 +30592,7 @@
       <w:tr>
         <w:tc>
           <w:tcPr/>
-          <w:bookmarkStart w:id="58" w:name="fig-gam-qbin-calibration"/>
+          <w:bookmarkStart w:id="60" w:name="fig-gam-qbin-calibration"/>
           <w:p>
             <w:pPr>
               <w:pStyle w:val="Compact"/>
@@ -28558,18 +30603,18 @@
                 <wp:inline>
                   <wp:extent cx="5334000" cy="2667000"/>
                   <wp:effectExtent b="0" l="0" r="0" t="0"/>
-                  <wp:docPr descr="" title="" id="56" name="Picture"/>
+                  <wp:docPr descr="" title="" id="58" name="Picture"/>
                   <a:graphic>
                     <a:graphicData uri="http://schemas.openxmlformats.org/drawingml/2006/picture">
                       <pic:pic>
                         <pic:nvPicPr>
-                          <pic:cNvPr descr="results_files/figure-docx/fig-gam-qbin-calibration-1.png" id="57" name="Picture"/>
+                          <pic:cNvPr descr="results_files/figure-docx/fig-gam-qbin-calibration-1.png" id="59" name="Picture"/>
                           <pic:cNvPicPr>
                             <a:picLocks noChangeArrowheads="1" noChangeAspect="1"/>
                           </pic:cNvPicPr>
                         </pic:nvPicPr>
                         <pic:blipFill>
-                          <a:blip r:embed="rId55"/>
+                          <a:blip r:embed="rId57"/>
                           <a:stretch>
                             <a:fillRect/>
                           </a:stretch>
@@ -28609,18 +30654,18 @@
               <w:t xml:space="preserve">Figure 5: Quasibinomial robustness analysis of intellectual humility and calibration of estimated performance. Lines show model-predicted estimates at the mean and ±1 SD of intellectual humility; shaded bands indicate 95% confidence intervals. The dashed diagonal indicates perfect calibration.</w:t>
             </w:r>
           </w:p>
-          <w:bookmarkEnd w:id="58"/>
+          <w:bookmarkEnd w:id="60"/>
         </w:tc>
       </w:tr>
     </w:tbl>
-    <w:bookmarkEnd w:id="59"/>
-    <w:bookmarkStart w:id="64" w:name="intellectual-humility-interaction-plots"/>
+    <w:bookmarkEnd w:id="61"/>
+    <w:bookmarkStart w:id="66" w:name="intellectual-humility-interaction-plots"/>
     <w:p>
       <w:pPr>
         <w:pStyle w:val="Heading4"/>
       </w:pPr>
       <w:r>
-        <w:t xml:space="preserve">1.4.3.4 Intellectual humility interaction plots</w:t>
+        <w:t xml:space="preserve">1.4.4.4 Intellectual humility interaction plots</w:t>
       </w:r>
     </w:p>
     <w:tbl>
@@ -28636,7 +30681,7 @@
       <w:tr>
         <w:tc>
           <w:tcPr/>
-          <w:bookmarkStart w:id="63" w:name="fig-gam-qbin-IH"/>
+          <w:bookmarkStart w:id="65" w:name="fig-gam-qbin-IH"/>
           <w:p>
             <w:pPr>
               <w:pStyle w:val="Compact"/>
@@ -28647,18 +30692,18 @@
                 <wp:inline>
                   <wp:extent cx="5334000" cy="2667000"/>
                   <wp:effectExtent b="0" l="0" r="0" t="0"/>
-                  <wp:docPr descr="" title="" id="61" name="Picture"/>
+                  <wp:docPr descr="" title="" id="63" name="Picture"/>
                   <a:graphic>
                     <a:graphicData uri="http://schemas.openxmlformats.org/drawingml/2006/picture">
                       <pic:pic>
                         <pic:nvPicPr>
-                          <pic:cNvPr descr="results_files/figure-docx/fig-gam-qbin-IH-1.png" id="62" name="Picture"/>
+                          <pic:cNvPr descr="results_files/figure-docx/fig-gam-qbin-IH-1.png" id="64" name="Picture"/>
                           <pic:cNvPicPr>
                             <a:picLocks noChangeArrowheads="1" noChangeAspect="1"/>
                           </pic:cNvPicPr>
                         </pic:nvPicPr>
                         <pic:blipFill>
-                          <a:blip r:embed="rId60"/>
+                          <a:blip r:embed="rId62"/>
                           <a:stretch>
                             <a:fillRect/>
                           </a:stretch>
@@ -28698,14 +30743,14 @@
               <w:t xml:space="preserve">Figure 6: Quasibinomial robustness analysis of intellectual humility, actual accuracy, and estimated performance. Lines show model-predicted estimates across the observed range of intellectual humility scores, separately for each level of actual accuracy; shaded bands indicate 95% confidence intervals.</w:t>
             </w:r>
           </w:p>
-          <w:bookmarkEnd w:id="63"/>
+          <w:bookmarkEnd w:id="65"/>
         </w:tc>
       </w:tr>
     </w:tbl>
-    <w:bookmarkEnd w:id="64"/>
-    <w:bookmarkEnd w:id="65"/>
     <w:bookmarkEnd w:id="66"/>
     <w:bookmarkEnd w:id="67"/>
+    <w:bookmarkEnd w:id="68"/>
+    <w:bookmarkEnd w:id="69"/>
     <w:sectPr/>
   </w:body>
 </w:document>

</xml_diff>